<commit_message>
fix(sidang) - template sidang dan tanda tangan
</commit_message>
<xml_diff>
--- a/template/SIDANG/BA sidang akhir TEMPLATE.docx
+++ b/template/SIDANG/BA sidang akhir TEMPLATE.docx
@@ -177,6 +177,7 @@
         </w:rPr>
         <w:t xml:space="preserve"> </w:t>
       </w:r>
+      <w:proofErr w:type="spellStart"/>
       <w:r>
         <w:rPr>
           <w:rFonts w:ascii="Times New Roman" w:hAnsi="Times New Roman" w:cs="Times New Roman"/>
@@ -185,6 +186,7 @@
         </w:rPr>
         <w:t>Mahasiswa</w:t>
       </w:r>
+      <w:proofErr w:type="spellEnd"/>
       <w:r>
         <w:rPr>
           <w:rFonts w:ascii="Times New Roman" w:hAnsi="Times New Roman" w:cs="Times New Roman"/>
@@ -216,6 +218,28 @@
         </w:rPr>
         <w:t>${nama_mhs}</w:t>
       </w:r>
+      <w:r>
+        <w:rPr>
+          <w:rFonts w:ascii="Times New Roman" w:hAnsi="Times New Roman" w:cs="Times New Roman"/>
+          <w:b/>
+          <w:bCs/>
+          <w:color w:val="000000" w:themeColor="text1"/>
+          <w:spacing w:val="-10"/>
+        </w:rPr>
+        <w:t xml:space="preserve"/>
+      </w:r>
+      <w:proofErr w:type="spellStart"/>
+      <w:r>
+        <w:rPr>
+          <w:rFonts w:ascii="Times New Roman" w:hAnsi="Times New Roman" w:cs="Times New Roman"/>
+          <w:b/>
+          <w:bCs/>
+          <w:color w:val="000000" w:themeColor="text1"/>
+          <w:spacing w:val="-10"/>
+        </w:rPr>
+        <w:t/>
+      </w:r>
+      <w:proofErr w:type="spellEnd"/>
       <w:r>
         <w:rPr>
           <w:rFonts w:ascii="Times New Roman" w:hAnsi="Times New Roman" w:cs="Times New Roman"/>
@@ -314,6 +338,7 @@
           <w:color w:val="000000" w:themeColor="text1"/>
         </w:rPr>
       </w:pPr>
+      <w:proofErr w:type="spellStart"/>
       <w:r>
         <w:rPr>
           <w:rFonts w:ascii="Times New Roman" w:hAnsi="Times New Roman" w:cs="Times New Roman"/>
@@ -321,6 +346,7 @@
         </w:rPr>
         <w:t>Judul</w:t>
       </w:r>
+      <w:proofErr w:type="spellEnd"/>
       <w:r>
         <w:rPr>
           <w:rFonts w:ascii="Times New Roman" w:hAnsi="Times New Roman" w:cs="Times New Roman"/>
@@ -329,6 +355,7 @@
         </w:rPr>
         <w:t xml:space="preserve"> </w:t>
       </w:r>
+      <w:proofErr w:type="spellStart"/>
       <w:r>
         <w:rPr>
           <w:rFonts w:ascii="Times New Roman" w:hAnsi="Times New Roman" w:cs="Times New Roman"/>
@@ -337,6 +364,7 @@
         </w:rPr>
         <w:t>Penelitian</w:t>
       </w:r>
+      <w:proofErr w:type="spellEnd"/>
       <w:r>
         <w:rPr>
           <w:rFonts w:ascii="Times New Roman" w:hAnsi="Times New Roman" w:cs="Times New Roman"/>
@@ -368,6 +396,24 @@
         </w:rPr>
         <w:t>${judul}</w:t>
       </w:r>
+      <w:r>
+        <w:rPr>
+          <w:rFonts w:ascii="Times New Roman" w:hAnsi="Times New Roman" w:cs="Times New Roman"/>
+          <w:color w:val="000000" w:themeColor="text1"/>
+          <w:spacing w:val="-10"/>
+        </w:rPr>
+        <w:t/>
+      </w:r>
+      <w:proofErr w:type="spellStart"/>
+      <w:r>
+        <w:rPr>
+          <w:rFonts w:ascii="Times New Roman" w:hAnsi="Times New Roman" w:cs="Times New Roman"/>
+          <w:color w:val="000000" w:themeColor="text1"/>
+          <w:spacing w:val="-10"/>
+        </w:rPr>
+        <w:t/>
+      </w:r>
+      <w:proofErr w:type="spellEnd"/>
       <w:r>
         <w:rPr>
           <w:rFonts w:ascii="Times New Roman" w:hAnsi="Times New Roman" w:cs="Times New Roman"/>
@@ -472,6 +518,42 @@
               </w:rPr>
               <w:t/>
             </w:r>
+            <w:proofErr w:type="spellStart"/>
+            <w:r>
+              <w:rPr>
+                <w:color w:val="000000" w:themeColor="text1"/>
+                <w:sz w:val="24"/>
+                <w:lang w:val="en-US"/>
+              </w:rPr>
+              <w:t/>
+            </w:r>
+            <w:proofErr w:type="spellEnd"/>
+            <w:r>
+              <w:rPr>
+                <w:color w:val="000000" w:themeColor="text1"/>
+                <w:sz w:val="24"/>
+                <w:lang w:val="en-US"/>
+              </w:rPr>
+              <w:t xml:space="preserve"/>
+            </w:r>
+            <w:proofErr w:type="spellStart"/>
+            <w:r>
+              <w:rPr>
+                <w:color w:val="000000" w:themeColor="text1"/>
+                <w:sz w:val="24"/>
+                <w:lang w:val="en-US"/>
+              </w:rPr>
+              <w:t/>
+            </w:r>
+            <w:proofErr w:type="spellEnd"/>
+            <w:r>
+              <w:rPr>
+                <w:color w:val="000000" w:themeColor="text1"/>
+                <w:sz w:val="24"/>
+                <w:lang w:val="en-US"/>
+              </w:rPr>
+              <w:t/>
+            </w:r>
           </w:p>
         </w:tc>
         <w:tc>
@@ -533,6 +615,17 @@
               </w:rPr>
               <w:t/>
             </w:r>
+            <w:proofErr w:type="spellStart"/>
+            <w:r>
+              <w:rPr>
+                <w:color w:val="000000" w:themeColor="text1"/>
+                <w:spacing w:val="-4"/>
+                <w:sz w:val="24"/>
+                <w:lang w:val="en-US"/>
+              </w:rPr>
+              <w:t/>
+            </w:r>
+            <w:proofErr w:type="spellEnd"/>
             <w:r>
               <w:rPr>
                 <w:color w:val="000000" w:themeColor="text1"/>
@@ -590,6 +683,7 @@
           <w:u w:val="single"/>
         </w:rPr>
       </w:pPr>
+      <w:proofErr w:type="spellStart"/>
       <w:r>
         <w:rPr>
           <w:rFonts w:ascii="Times New Roman" w:hAnsi="Times New Roman" w:cs="Times New Roman"/>
@@ -598,7 +692,18 @@
           <w:color w:val="000000" w:themeColor="text1"/>
           <w:u w:val="single"/>
         </w:rPr>
-        <w:t>Penilaian:</w:t>
+        <w:t>Penilaian</w:t>
+      </w:r>
+      <w:proofErr w:type="spellEnd"/>
+      <w:r>
+        <w:rPr>
+          <w:rFonts w:ascii="Times New Roman" w:hAnsi="Times New Roman" w:cs="Times New Roman"/>
+          <w:b/>
+          <w:bCs/>
+          <w:color w:val="000000" w:themeColor="text1"/>
+          <w:u w:val="single"/>
+        </w:rPr>
+        <w:t>:</w:t>
       </w:r>
     </w:p>
     <w:tbl>
@@ -1810,6 +1915,7 @@
         </w:rPr>
         <w:t xml:space="preserve"> </w:t>
       </w:r>
+      <w:proofErr w:type="spellStart"/>
       <w:r>
         <w:rPr>
           <w:rFonts w:ascii="Times New Roman" w:hAnsi="Times New Roman" w:cs="Times New Roman"/>
@@ -1818,6 +1924,7 @@
         </w:rPr>
         <w:t>Doktor</w:t>
       </w:r>
+      <w:proofErr w:type="spellEnd"/>
     </w:p>
     <w:p>
       <w:pPr>
@@ -1828,6 +1935,7 @@
           <w:color w:val="000000" w:themeColor="text1"/>
         </w:rPr>
       </w:pPr>
+      <w:proofErr w:type="spellStart"/>
       <w:r>
         <w:rPr>
           <w:rFonts w:ascii="Times New Roman" w:hAnsi="Times New Roman" w:cs="Times New Roman"/>
@@ -1835,6 +1943,7 @@
         </w:rPr>
         <w:t>Indeks</w:t>
       </w:r>
+      <w:proofErr w:type="spellEnd"/>
       <w:r>
         <w:rPr>
           <w:rFonts w:ascii="Times New Roman" w:hAnsi="Times New Roman" w:cs="Times New Roman"/>
@@ -1858,6 +1967,7 @@
         </w:rPr>
         <w:t xml:space="preserve"> </w:t>
       </w:r>
+      <w:proofErr w:type="spellStart"/>
       <w:r>
         <w:rPr>
           <w:rFonts w:ascii="Times New Roman" w:hAnsi="Times New Roman" w:cs="Times New Roman"/>
@@ -1865,6 +1975,7 @@
         </w:rPr>
         <w:t>jika</w:t>
       </w:r>
+      <w:proofErr w:type="spellEnd"/>
       <w:r>
         <w:rPr>
           <w:rFonts w:ascii="Times New Roman" w:hAnsi="Times New Roman" w:cs="Times New Roman"/>
@@ -1918,6 +2029,7 @@
         </w:rPr>
         <w:t xml:space="preserve"> </w:t>
       </w:r>
+      <w:proofErr w:type="spellStart"/>
       <w:r>
         <w:rPr>
           <w:rFonts w:ascii="Times New Roman" w:hAnsi="Times New Roman" w:cs="Times New Roman"/>
@@ -1925,6 +2037,7 @@
         </w:rPr>
         <w:t>Indeks</w:t>
       </w:r>
+      <w:proofErr w:type="spellEnd"/>
       <w:r>
         <w:rPr>
           <w:rFonts w:ascii="Times New Roman" w:hAnsi="Times New Roman" w:cs="Times New Roman"/>
@@ -1948,6 +2061,7 @@
         </w:rPr>
         <w:t xml:space="preserve"> </w:t>
       </w:r>
+      <w:proofErr w:type="spellStart"/>
       <w:r>
         <w:rPr>
           <w:rFonts w:ascii="Times New Roman" w:hAnsi="Times New Roman" w:cs="Times New Roman"/>
@@ -1955,6 +2069,7 @@
         </w:rPr>
         <w:t>jika</w:t>
       </w:r>
+      <w:proofErr w:type="spellEnd"/>
       <w:r>
         <w:rPr>
           <w:rFonts w:ascii="Times New Roman" w:hAnsi="Times New Roman" w:cs="Times New Roman"/>
@@ -2028,7 +2143,55 @@
           <w:rFonts w:ascii="Times New Roman" w:hAnsi="Times New Roman" w:cs="Times New Roman"/>
           <w:color w:val="000000" w:themeColor="text1"/>
         </w:rPr>
-        <w:t>4,5; Indeks B, jika jika 3,5 ≤ NA &lt; 4,0;</w:t>
+        <w:t xml:space="preserve">4,5; </w:t>
+      </w:r>
+      <w:proofErr w:type="spellStart"/>
+      <w:r>
+        <w:rPr>
+          <w:rFonts w:ascii="Times New Roman" w:hAnsi="Times New Roman" w:cs="Times New Roman"/>
+          <w:color w:val="000000" w:themeColor="text1"/>
+        </w:rPr>
+        <w:t>Indeks</w:t>
+      </w:r>
+      <w:proofErr w:type="spellEnd"/>
+      <w:r>
+        <w:rPr>
+          <w:rFonts w:ascii="Times New Roman" w:hAnsi="Times New Roman" w:cs="Times New Roman"/>
+          <w:color w:val="000000" w:themeColor="text1"/>
+        </w:rPr>
+        <w:t xml:space="preserve"> B, </w:t>
+      </w:r>
+      <w:proofErr w:type="spellStart"/>
+      <w:r>
+        <w:rPr>
+          <w:rFonts w:ascii="Times New Roman" w:hAnsi="Times New Roman" w:cs="Times New Roman"/>
+          <w:color w:val="000000" w:themeColor="text1"/>
+        </w:rPr>
+        <w:t>jika</w:t>
+      </w:r>
+      <w:proofErr w:type="spellEnd"/>
+      <w:r>
+        <w:rPr>
+          <w:rFonts w:ascii="Times New Roman" w:hAnsi="Times New Roman" w:cs="Times New Roman"/>
+          <w:color w:val="000000" w:themeColor="text1"/>
+        </w:rPr>
+        <w:t xml:space="preserve"> </w:t>
+      </w:r>
+      <w:proofErr w:type="spellStart"/>
+      <w:r>
+        <w:rPr>
+          <w:rFonts w:ascii="Times New Roman" w:hAnsi="Times New Roman" w:cs="Times New Roman"/>
+          <w:color w:val="000000" w:themeColor="text1"/>
+        </w:rPr>
+        <w:t>jika</w:t>
+      </w:r>
+      <w:proofErr w:type="spellEnd"/>
+      <w:r>
+        <w:rPr>
+          <w:rFonts w:ascii="Times New Roman" w:hAnsi="Times New Roman" w:cs="Times New Roman"/>
+          <w:color w:val="000000" w:themeColor="text1"/>
+        </w:rPr>
+        <w:t xml:space="preserve"> 3,5 ≤ NA &lt; 4,0;</w:t>
       </w:r>
     </w:p>
     <w:p>
@@ -2164,6 +2327,7 @@
           <w:color w:val="000000" w:themeColor="text1"/>
         </w:rPr>
       </w:pPr>
+      <w:proofErr w:type="spellStart"/>
       <w:r>
         <w:rPr>
           <w:rFonts w:ascii="Times New Roman" w:hAnsi="Times New Roman" w:cs="Times New Roman"/>
@@ -2171,7 +2335,37 @@
           <w:bCs/>
           <w:color w:val="000000" w:themeColor="text1"/>
         </w:rPr>
-        <w:t>Capaian akademik:</w:t>
+        <w:t>Capaian</w:t>
+      </w:r>
+      <w:proofErr w:type="spellEnd"/>
+      <w:r>
+        <w:rPr>
+          <w:rFonts w:ascii="Times New Roman" w:hAnsi="Times New Roman" w:cs="Times New Roman"/>
+          <w:b/>
+          <w:bCs/>
+          <w:color w:val="000000" w:themeColor="text1"/>
+        </w:rPr>
+        <w:t xml:space="preserve"> </w:t>
+      </w:r>
+      <w:proofErr w:type="spellStart"/>
+      <w:r>
+        <w:rPr>
+          <w:rFonts w:ascii="Times New Roman" w:hAnsi="Times New Roman" w:cs="Times New Roman"/>
+          <w:b/>
+          <w:bCs/>
+          <w:color w:val="000000" w:themeColor="text1"/>
+        </w:rPr>
+        <w:t>akademik</w:t>
+      </w:r>
+      <w:proofErr w:type="spellEnd"/>
+      <w:r>
+        <w:rPr>
+          <w:rFonts w:ascii="Times New Roman" w:hAnsi="Times New Roman" w:cs="Times New Roman"/>
+          <w:b/>
+          <w:bCs/>
+          <w:color w:val="000000" w:themeColor="text1"/>
+        </w:rPr>
+        <w:t>:</w:t>
       </w:r>
     </w:p>
     <w:p>
@@ -2194,12 +2388,14 @@
           <w:color w:val="000000" w:themeColor="text1"/>
         </w:rPr>
       </w:pPr>
+      <w:proofErr w:type="spellStart"/>
       <w:r>
         <w:rPr>
           <w:color w:val="000000" w:themeColor="text1"/>
         </w:rPr>
         <w:t>Indeks</w:t>
       </w:r>
+      <w:proofErr w:type="spellEnd"/>
       <w:r>
         <w:rPr>
           <w:color w:val="000000" w:themeColor="text1"/>
@@ -2207,12 +2403,14 @@
         </w:rPr>
         <w:t xml:space="preserve"> </w:t>
       </w:r>
+      <w:proofErr w:type="spellStart"/>
       <w:r>
         <w:rPr>
           <w:color w:val="000000" w:themeColor="text1"/>
         </w:rPr>
         <w:t>prestasi</w:t>
       </w:r>
+      <w:proofErr w:type="spellEnd"/>
       <w:r>
         <w:rPr>
           <w:color w:val="000000" w:themeColor="text1"/>
@@ -2220,12 +2418,14 @@
         </w:rPr>
         <w:t xml:space="preserve"> </w:t>
       </w:r>
+      <w:proofErr w:type="spellStart"/>
       <w:r>
         <w:rPr>
           <w:color w:val="000000" w:themeColor="text1"/>
         </w:rPr>
         <w:t>kumulatif</w:t>
       </w:r>
+      <w:proofErr w:type="spellEnd"/>
       <w:r>
         <w:rPr>
           <w:color w:val="000000" w:themeColor="text1"/>
@@ -2263,68 +2463,9 @@
       <w:r>
         <w:rPr>
           <w:color w:val="000000" w:themeColor="text1"/>
-          <w:spacing w:val="-10"/>
-        </w:rPr>
-        <w:t>3.88</w:t>
-      </w:r>
-      <w:r>
-        <w:rPr>
-          <w:color w:val="000000" w:themeColor="text1"/>
-          <w:spacing w:val="-10"/>
-        </w:rPr>
-        <w:t xml:space="preserve"> </w:t>
-      </w:r>
-      <w:r>
-        <w:rPr>
-          <w:color w:val="000000" w:themeColor="text1"/>
-          <w:spacing w:val="-10"/>
-        </w:rPr>
-        <w:t>(</w:t>
-      </w:r>
-      <w:r>
-        <w:rPr>
-          <w:color w:val="000000" w:themeColor="text1"/>
-          <w:spacing w:val="-10"/>
-        </w:rPr>
-        <w:t>1</w:t>
-      </w:r>
-      <w:r>
-        <w:rPr>
-          <w:color w:val="000000" w:themeColor="text1"/>
-          <w:spacing w:val="-10"/>
-        </w:rPr>
-        <w:t>2</w:t>
-      </w:r>
-      <w:r>
-        <w:rPr>
-          <w:color w:val="000000" w:themeColor="text1"/>
-          <w:spacing w:val="-10"/>
-        </w:rPr>
-        <w:t xml:space="preserve"> </w:t>
-      </w:r>
-      <w:proofErr w:type="gramStart"/>
-      <w:r>
-        <w:rPr>
-          <w:color w:val="000000" w:themeColor="text1"/>
-          <w:spacing w:val="-10"/>
-        </w:rPr>
-        <w:t>Semester</w:t>
-      </w:r>
-      <w:r>
-        <w:rPr>
-          <w:color w:val="000000" w:themeColor="text1"/>
-          <w:spacing w:val="-10"/>
-        </w:rPr>
-        <w:t xml:space="preserve"> </w:t>
-      </w:r>
-      <w:r>
-        <w:rPr>
-          <w:color w:val="000000" w:themeColor="text1"/>
-          <w:spacing w:val="-10"/>
-        </w:rPr>
-        <w:t>)</w:t>
-      </w:r>
-      <w:proofErr w:type="gramEnd"/>
+        </w:rPr>
+        <w:t>${ip}</w:t>
+      </w:r>
     </w:p>
     <w:p>
       <w:pPr>
@@ -2347,11 +2488,75 @@
           <w:color w:val="000000" w:themeColor="text1"/>
         </w:rPr>
       </w:pPr>
-      <w:r>
-        <w:rPr>
-          <w:color w:val="000000" w:themeColor="text1"/>
-        </w:rPr>
-        <w:t>Jumlah publikasi ilmiah (jurnal bereputasi):</w:t>
+      <w:proofErr w:type="spellStart"/>
+      <w:r>
+        <w:rPr>
+          <w:color w:val="000000" w:themeColor="text1"/>
+        </w:rPr>
+        <w:t>Jumlah</w:t>
+      </w:r>
+      <w:proofErr w:type="spellEnd"/>
+      <w:r>
+        <w:rPr>
+          <w:color w:val="000000" w:themeColor="text1"/>
+        </w:rPr>
+        <w:t xml:space="preserve"> </w:t>
+      </w:r>
+      <w:proofErr w:type="spellStart"/>
+      <w:r>
+        <w:rPr>
+          <w:color w:val="000000" w:themeColor="text1"/>
+        </w:rPr>
+        <w:t>publikasi</w:t>
+      </w:r>
+      <w:proofErr w:type="spellEnd"/>
+      <w:r>
+        <w:rPr>
+          <w:color w:val="000000" w:themeColor="text1"/>
+        </w:rPr>
+        <w:t xml:space="preserve"> </w:t>
+      </w:r>
+      <w:proofErr w:type="spellStart"/>
+      <w:r>
+        <w:rPr>
+          <w:color w:val="000000" w:themeColor="text1"/>
+        </w:rPr>
+        <w:t>ilmiah</w:t>
+      </w:r>
+      <w:proofErr w:type="spellEnd"/>
+      <w:r>
+        <w:rPr>
+          <w:color w:val="000000" w:themeColor="text1"/>
+        </w:rPr>
+        <w:t xml:space="preserve"> (</w:t>
+      </w:r>
+      <w:proofErr w:type="spellStart"/>
+      <w:r>
+        <w:rPr>
+          <w:color w:val="000000" w:themeColor="text1"/>
+        </w:rPr>
+        <w:t>jurnal</w:t>
+      </w:r>
+      <w:proofErr w:type="spellEnd"/>
+      <w:r>
+        <w:rPr>
+          <w:color w:val="000000" w:themeColor="text1"/>
+        </w:rPr>
+        <w:t xml:space="preserve"> </w:t>
+      </w:r>
+      <w:proofErr w:type="spellStart"/>
+      <w:r>
+        <w:rPr>
+          <w:color w:val="000000" w:themeColor="text1"/>
+        </w:rPr>
+        <w:t>bereputasi</w:t>
+      </w:r>
+      <w:proofErr w:type="spellEnd"/>
+      <w:r>
+        <w:rPr>
+          <w:color w:val="000000" w:themeColor="text1"/>
+        </w:rPr>
+        <w:t>):</w:t>
       </w:r>
       <w:r>
         <w:rPr>
@@ -2359,6 +2564,7 @@
         </w:rPr>
         <w:tab/>
       </w:r>
+      <w:proofErr w:type="gramStart"/>
       <w:r>
         <w:rPr>
           <w:color w:val="000000" w:themeColor="text1"/>
@@ -2369,14 +2575,43 @@
       <w:r>
         <w:rPr>
           <w:color w:val="000000" w:themeColor="text1"/>
+          <w:spacing w:val="-10"/>
         </w:rPr>
         <w:tab/>
-      </w:r>
-      <w:r>
-        <w:rPr>
-          <w:color w:val="000000" w:themeColor="text1"/>
-        </w:rPr>
-        <w:t>1 jurnal Q1</w:t>
+        <w:t xml:space="preserve"> </w:t>
+      </w:r>
+      <w:r>
+        <w:rPr>
+          <w:color w:val="000000" w:themeColor="text1"/>
+        </w:rPr>
+        <w:t>${jml_jurnal_q1}</w:t>
+      </w:r>
+      <w:proofErr w:type="gramEnd"/>
+      <w:r>
+        <w:rPr>
+          <w:color w:val="000000" w:themeColor="text1"/>
+        </w:rPr>
+        <w:t/>
+      </w:r>
+      <w:r>
+        <w:rPr>
+          <w:color w:val="000000" w:themeColor="text1"/>
+        </w:rPr>
+        <w:t xml:space="preserve"> </w:t>
+      </w:r>
+      <w:proofErr w:type="spellStart"/>
+      <w:r>
+        <w:rPr>
+          <w:color w:val="000000" w:themeColor="text1"/>
+        </w:rPr>
+        <w:t>jurnal</w:t>
+      </w:r>
+      <w:proofErr w:type="spellEnd"/>
+      <w:r>
+        <w:rPr>
+          <w:color w:val="000000" w:themeColor="text1"/>
+        </w:rPr>
+        <w:t xml:space="preserve"> Q1</w:t>
       </w:r>
       <w:r>
         <w:rPr>
@@ -2406,12 +2641,14 @@
           <w:color w:val="000000" w:themeColor="text1"/>
         </w:rPr>
       </w:pPr>
+      <w:proofErr w:type="spellStart"/>
       <w:r>
         <w:rPr>
           <w:color w:val="000000" w:themeColor="text1"/>
         </w:rPr>
         <w:t>Jumlah</w:t>
       </w:r>
+      <w:proofErr w:type="spellEnd"/>
       <w:r>
         <w:rPr>
           <w:color w:val="000000" w:themeColor="text1"/>
@@ -2419,12 +2656,14 @@
         </w:rPr>
         <w:t xml:space="preserve"> </w:t>
       </w:r>
+      <w:proofErr w:type="spellStart"/>
       <w:r>
         <w:rPr>
           <w:color w:val="000000" w:themeColor="text1"/>
         </w:rPr>
         <w:t>publikasi</w:t>
       </w:r>
+      <w:proofErr w:type="spellEnd"/>
       <w:r>
         <w:rPr>
           <w:color w:val="000000" w:themeColor="text1"/>
@@ -2432,12 +2671,14 @@
         </w:rPr>
         <w:t xml:space="preserve"> </w:t>
       </w:r>
+      <w:proofErr w:type="spellStart"/>
       <w:r>
         <w:rPr>
           <w:color w:val="000000" w:themeColor="text1"/>
         </w:rPr>
         <w:t>ilmiah</w:t>
       </w:r>
+      <w:proofErr w:type="spellEnd"/>
       <w:r>
         <w:rPr>
           <w:color w:val="000000" w:themeColor="text1"/>
@@ -2449,8 +2690,16 @@
         <w:rPr>
           <w:color w:val="000000" w:themeColor="text1"/>
         </w:rPr>
-        <w:t>(selain</w:t>
-      </w:r>
+        <w:t>(</w:t>
+      </w:r>
+      <w:proofErr w:type="spellStart"/>
+      <w:r>
+        <w:rPr>
+          <w:color w:val="000000" w:themeColor="text1"/>
+        </w:rPr>
+        <w:t>selain</w:t>
+      </w:r>
+      <w:proofErr w:type="spellEnd"/>
       <w:r>
         <w:rPr>
           <w:color w:val="000000" w:themeColor="text1"/>
@@ -2458,18 +2707,36 @@
         </w:rPr>
         <w:t xml:space="preserve"> </w:t>
       </w:r>
+      <w:proofErr w:type="spellStart"/>
       <w:r>
         <w:rPr>
           <w:color w:val="000000" w:themeColor="text1"/>
         </w:rPr>
         <w:t>jurnal</w:t>
       </w:r>
+      <w:proofErr w:type="spellEnd"/>
       <w:r>
         <w:rPr>
           <w:color w:val="000000" w:themeColor="text1"/>
           <w:spacing w:val="-2"/>
         </w:rPr>
-        <w:t xml:space="preserve"> bereputasi)</w:t>
+        <w:t xml:space="preserve"> </w:t>
+      </w:r>
+      <w:proofErr w:type="spellStart"/>
+      <w:r>
+        <w:rPr>
+          <w:color w:val="000000" w:themeColor="text1"/>
+          <w:spacing w:val="-2"/>
+        </w:rPr>
+        <w:t>bereputasi</w:t>
+      </w:r>
+      <w:proofErr w:type="spellEnd"/>
+      <w:r>
+        <w:rPr>
+          <w:color w:val="000000" w:themeColor="text1"/>
+          <w:spacing w:val="-2"/>
+        </w:rPr>
+        <w:t>)</w:t>
       </w:r>
       <w:r>
         <w:rPr>
@@ -2488,6 +2755,7 @@
       <w:r>
         <w:rPr>
           <w:color w:val="000000" w:themeColor="text1"/>
+          <w:spacing w:val="-10"/>
         </w:rPr>
         <w:tab/>
         <w:t xml:space="preserve"> </w:t>
@@ -2496,14 +2764,14 @@
         <w:rPr>
           <w:color w:val="000000" w:themeColor="text1"/>
         </w:rPr>
-        <w:t>-</w:t>
+        <w:t>${jml_jurnal_bereputasi1}</w:t>
       </w:r>
       <w:proofErr w:type="gramEnd"/>
       <w:r>
         <w:rPr>
           <w:color w:val="000000" w:themeColor="text1"/>
         </w:rPr>
-        <w:t>--</w:t>
+        <w:t/>
       </w:r>
     </w:p>
     <w:p>
@@ -2527,11 +2795,89 @@
           <w:color w:val="000000" w:themeColor="text1"/>
         </w:rPr>
       </w:pPr>
-      <w:r>
-        <w:rPr>
-          <w:color w:val="000000" w:themeColor="text1"/>
-        </w:rPr>
-        <w:t>Jumlah publikasi ilmiah (selain jurnal bereputasi)</w:t>
+      <w:proofErr w:type="spellStart"/>
+      <w:r>
+        <w:rPr>
+          <w:color w:val="000000" w:themeColor="text1"/>
+        </w:rPr>
+        <w:t>Jumlah</w:t>
+      </w:r>
+      <w:proofErr w:type="spellEnd"/>
+      <w:r>
+        <w:rPr>
+          <w:color w:val="000000" w:themeColor="text1"/>
+        </w:rPr>
+        <w:t xml:space="preserve"> </w:t>
+      </w:r>
+      <w:proofErr w:type="spellStart"/>
+      <w:r>
+        <w:rPr>
+          <w:color w:val="000000" w:themeColor="text1"/>
+        </w:rPr>
+        <w:t>publikasi</w:t>
+      </w:r>
+      <w:proofErr w:type="spellEnd"/>
+      <w:r>
+        <w:rPr>
+          <w:color w:val="000000" w:themeColor="text1"/>
+        </w:rPr>
+        <w:t xml:space="preserve"> </w:t>
+      </w:r>
+      <w:proofErr w:type="spellStart"/>
+      <w:r>
+        <w:rPr>
+          <w:color w:val="000000" w:themeColor="text1"/>
+        </w:rPr>
+        <w:t>ilmiah</w:t>
+      </w:r>
+      <w:proofErr w:type="spellEnd"/>
+      <w:r>
+        <w:rPr>
+          <w:color w:val="000000" w:themeColor="text1"/>
+        </w:rPr>
+        <w:t xml:space="preserve"> (</w:t>
+      </w:r>
+      <w:proofErr w:type="spellStart"/>
+      <w:r>
+        <w:rPr>
+          <w:color w:val="000000" w:themeColor="text1"/>
+        </w:rPr>
+        <w:t>selain</w:t>
+      </w:r>
+      <w:proofErr w:type="spellEnd"/>
+      <w:r>
+        <w:rPr>
+          <w:color w:val="000000" w:themeColor="text1"/>
+        </w:rPr>
+        <w:t xml:space="preserve"> </w:t>
+      </w:r>
+      <w:proofErr w:type="spellStart"/>
+      <w:r>
+        <w:rPr>
+          <w:color w:val="000000" w:themeColor="text1"/>
+        </w:rPr>
+        <w:t>jurnal</w:t>
+      </w:r>
+      <w:proofErr w:type="spellEnd"/>
+      <w:r>
+        <w:rPr>
+          <w:color w:val="000000" w:themeColor="text1"/>
+        </w:rPr>
+        <w:t xml:space="preserve"> </w:t>
+      </w:r>
+      <w:proofErr w:type="spellStart"/>
+      <w:r>
+        <w:rPr>
+          <w:color w:val="000000" w:themeColor="text1"/>
+        </w:rPr>
+        <w:t>bereputasi</w:t>
+      </w:r>
+      <w:proofErr w:type="spellEnd"/>
+      <w:r>
+        <w:rPr>
+          <w:color w:val="000000" w:themeColor="text1"/>
+        </w:rPr>
+        <w:t>)</w:t>
       </w:r>
       <w:r>
         <w:rPr>
@@ -2549,8 +2895,13 @@
         <w:rPr>
           <w:color w:val="000000" w:themeColor="text1"/>
         </w:rPr>
-        <w:tab/>
-        <w:t>---</w:t>
+        <w:t xml:space="preserve">   </w:t>
+      </w:r>
+      <w:r>
+        <w:rPr>
+          <w:color w:val="000000" w:themeColor="text1"/>
+        </w:rPr>
+        <w:t>${jml_jurnal_bereputasi2}</w:t>
       </w:r>
     </w:p>
     <w:p>
@@ -2822,7 +3173,35 @@
         <w:rPr>
           <w:color w:val="000000" w:themeColor="text1"/>
         </w:rPr>
-        <w:t>LULUS Sidang Doktor, dengan usulan Nilai Akhir:</w:t>
+        <w:t xml:space="preserve">LULUS Sidang </w:t>
+      </w:r>
+      <w:proofErr w:type="spellStart"/>
+      <w:r>
+        <w:rPr>
+          <w:color w:val="000000" w:themeColor="text1"/>
+        </w:rPr>
+        <w:t>Doktor</w:t>
+      </w:r>
+      <w:proofErr w:type="spellEnd"/>
+      <w:r>
+        <w:rPr>
+          <w:color w:val="000000" w:themeColor="text1"/>
+        </w:rPr>
+        <w:t xml:space="preserve">, </w:t>
+      </w:r>
+      <w:proofErr w:type="spellStart"/>
+      <w:r>
+        <w:rPr>
+          <w:color w:val="000000" w:themeColor="text1"/>
+        </w:rPr>
+        <w:t>dengan</w:t>
+      </w:r>
+      <w:proofErr w:type="spellEnd"/>
+      <w:r>
+        <w:rPr>
+          <w:color w:val="000000" w:themeColor="text1"/>
+        </w:rPr>
+        <w:t xml:space="preserve"> usulan Nilai Akhir:</w:t>
       </w:r>
     </w:p>
     <w:p>
@@ -2849,7 +3228,35 @@
         <w:rPr>
           <w:color w:val="000000" w:themeColor="text1"/>
         </w:rPr>
-        <w:t>dan Rekomendasi Yudisium: ……………………….</w:t>
+        <w:t xml:space="preserve">dan </w:t>
+      </w:r>
+      <w:proofErr w:type="spellStart"/>
+      <w:r>
+        <w:rPr>
+          <w:color w:val="000000" w:themeColor="text1"/>
+        </w:rPr>
+        <w:t>Rekomendasi</w:t>
+      </w:r>
+      <w:proofErr w:type="spellEnd"/>
+      <w:r>
+        <w:rPr>
+          <w:color w:val="000000" w:themeColor="text1"/>
+        </w:rPr>
+        <w:t xml:space="preserve"> </w:t>
+      </w:r>
+      <w:proofErr w:type="spellStart"/>
+      <w:r>
+        <w:rPr>
+          <w:color w:val="000000" w:themeColor="text1"/>
+        </w:rPr>
+        <w:t>Yudisium</w:t>
+      </w:r>
+      <w:proofErr w:type="spellEnd"/>
+      <w:r>
+        <w:rPr>
+          <w:color w:val="000000" w:themeColor="text1"/>
+        </w:rPr>
+        <w:t>: ……………………….</w:t>
       </w:r>
     </w:p>
     <w:p>
@@ -2876,8 +3283,44 @@
         <w:rPr>
           <w:color w:val="000000" w:themeColor="text1"/>
         </w:rPr>
-        <w:t>Tidak Lulus Sidang Doktor dan harus mengulang Sidang Doktor</w:t>
-      </w:r>
+        <w:t xml:space="preserve">Tidak Lulus Sidang </w:t>
+      </w:r>
+      <w:proofErr w:type="spellStart"/>
+      <w:r>
+        <w:rPr>
+          <w:color w:val="000000" w:themeColor="text1"/>
+        </w:rPr>
+        <w:t>Doktor</w:t>
+      </w:r>
+      <w:proofErr w:type="spellEnd"/>
+      <w:r>
+        <w:rPr>
+          <w:color w:val="000000" w:themeColor="text1"/>
+        </w:rPr>
+        <w:t xml:space="preserve"> dan harus </w:t>
+      </w:r>
+      <w:proofErr w:type="spellStart"/>
+      <w:r>
+        <w:rPr>
+          <w:color w:val="000000" w:themeColor="text1"/>
+        </w:rPr>
+        <w:t>mengulang</w:t>
+      </w:r>
+      <w:proofErr w:type="spellEnd"/>
+      <w:r>
+        <w:rPr>
+          <w:color w:val="000000" w:themeColor="text1"/>
+        </w:rPr>
+        <w:t xml:space="preserve"> Sidang </w:t>
+      </w:r>
+      <w:proofErr w:type="spellStart"/>
+      <w:r>
+        <w:rPr>
+          <w:color w:val="000000" w:themeColor="text1"/>
+        </w:rPr>
+        <w:t>Doktor</w:t>
+      </w:r>
+      <w:proofErr w:type="spellEnd"/>
     </w:p>
     <w:p>
       <w:pPr>
@@ -3231,11 +3674,52 @@
             <w:r>
               <w:rPr>
                 <w:color w:val="000000" w:themeColor="text1"/>
+                <w:spacing w:val="-10"/>
+              </w:rPr>
+              <w:t>${nama_ketua_pembimbing}</w:t>
+            </w:r>
+            <w:r>
+              <w:rPr>
+                <w:color w:val="000000" w:themeColor="text1"/>
+                <w:sz w:val="24"/>
+                <w:szCs w:val="24"/>
+              </w:rPr>
+              <w:t xml:space="preserve"/>
+            </w:r>
+            <w:r>
+              <w:rPr>
+                <w:color w:val="000000" w:themeColor="text1"/>
+                <w:sz w:val="24"/>
+                <w:szCs w:val="24"/>
+              </w:rPr>
+              <w:t/>
+            </w:r>
+            <w:r>
+              <w:rPr>
+                <w:color w:val="000000" w:themeColor="text1"/>
+                <w:spacing w:val="-3"/>
+                <w:sz w:val="24"/>
+                <w:szCs w:val="24"/>
+              </w:rPr>
+              <w:t xml:space="preserve"/>
+            </w:r>
+            <w:r>
+              <w:rPr>
+                <w:color w:val="000000" w:themeColor="text1"/>
                 <w:spacing w:val="-2"/>
                 <w:sz w:val="24"/>
+                <w:szCs w:val="24"/>
+              </w:rPr>
+              <w:t/>
+            </w:r>
+            <w:r>
+              <w:rPr>
+                <w:color w:val="000000" w:themeColor="text1"/>
+                <w:sz w:val="24"/>
+                <w:szCs w:val="24"/>
                 <w:lang w:val="en-US"/>
               </w:rPr>
-              <w:t>${nama_penguji_i}</w:t>
+              <w:t/>
             </w:r>
           </w:p>
         </w:tc>
@@ -3359,11 +3843,53 @@
             <w:r>
               <w:rPr>
                 <w:color w:val="000000" w:themeColor="text1"/>
-                <w:spacing w:val="-2"/>
-                <w:sz w:val="24"/>
+                <w:spacing w:val="-10"/>
+              </w:rPr>
+              <w:t>${nama_pembimbing_i}</w:t>
+            </w:r>
+            <w:r>
+              <w:rPr>
+                <w:color w:val="000000" w:themeColor="text1"/>
+                <w:sz w:val="24"/>
+                <w:szCs w:val="24"/>
                 <w:lang w:val="en-US"/>
               </w:rPr>
-              <w:t>${nama_penguji_ii}</w:t>
+              <w:t xml:space="preserve"/>
+            </w:r>
+            <w:r>
+              <w:rPr>
+                <w:color w:val="000000" w:themeColor="text1"/>
+                <w:sz w:val="24"/>
+                <w:szCs w:val="24"/>
+              </w:rPr>
+              <w:t/>
+            </w:r>
+            <w:r>
+              <w:rPr>
+                <w:color w:val="000000" w:themeColor="text1"/>
+                <w:spacing w:val="-13"/>
+                <w:sz w:val="24"/>
+                <w:szCs w:val="24"/>
+              </w:rPr>
+              <w:t xml:space="preserve"/>
+            </w:r>
+            <w:r>
+              <w:rPr>
+                <w:color w:val="000000" w:themeColor="text1"/>
+                <w:spacing w:val="-5"/>
+                <w:sz w:val="24"/>
+                <w:szCs w:val="24"/>
+              </w:rPr>
+              <w:t/>
+            </w:r>
+            <w:r>
+              <w:rPr>
+                <w:color w:val="000000" w:themeColor="text1"/>
+                <w:sz w:val="24"/>
+                <w:szCs w:val="24"/>
+                <w:lang w:val="en-US"/>
+              </w:rPr>
+              <w:t/>
             </w:r>
           </w:p>
         </w:tc>
@@ -3479,11 +4005,53 @@
             <w:r>
               <w:rPr>
                 <w:color w:val="000000" w:themeColor="text1"/>
-                <w:spacing w:val="-2"/>
-                <w:sz w:val="24"/>
+                <w:spacing w:val="-10"/>
+              </w:rPr>
+              <w:t>${nama_pembimbing_ii}</w:t>
+            </w:r>
+            <w:r>
+              <w:rPr>
+                <w:color w:val="000000" w:themeColor="text1"/>
+                <w:sz w:val="24"/>
+                <w:szCs w:val="24"/>
                 <w:lang w:val="en-US"/>
               </w:rPr>
-              <w:t>${nama_penguji_iii}</w:t>
+              <w:t xml:space="preserve"/>
+            </w:r>
+            <w:r>
+              <w:rPr>
+                <w:color w:val="000000" w:themeColor="text1"/>
+                <w:sz w:val="24"/>
+                <w:szCs w:val="24"/>
+              </w:rPr>
+              <w:t/>
+            </w:r>
+            <w:r>
+              <w:rPr>
+                <w:color w:val="000000" w:themeColor="text1"/>
+                <w:spacing w:val="-13"/>
+                <w:sz w:val="24"/>
+                <w:szCs w:val="24"/>
+              </w:rPr>
+              <w:t xml:space="preserve"/>
+            </w:r>
+            <w:r>
+              <w:rPr>
+                <w:color w:val="000000" w:themeColor="text1"/>
+                <w:spacing w:val="-5"/>
+                <w:sz w:val="24"/>
+                <w:szCs w:val="24"/>
+              </w:rPr>
+              <w:t/>
+            </w:r>
+            <w:r>
+              <w:rPr>
+                <w:color w:val="000000" w:themeColor="text1"/>
+                <w:sz w:val="24"/>
+                <w:szCs w:val="24"/>
+                <w:lang w:val="en-US"/>
+              </w:rPr>
+              <w:t/>
             </w:r>
           </w:p>
         </w:tc>
@@ -3600,11 +4168,35 @@
             <w:r>
               <w:rPr>
                 <w:color w:val="000000" w:themeColor="text1"/>
-                <w:spacing w:val="-2"/>
-                <w:sz w:val="24"/>
+                <w:spacing w:val="-10"/>
+              </w:rPr>
+              <w:t>${nama_penguji_i}</w:t>
+            </w:r>
+            <w:r>
+              <w:rPr>
+                <w:color w:val="000000" w:themeColor="text1"/>
+                <w:sz w:val="24"/>
+                <w:szCs w:val="24"/>
                 <w:lang w:val="en-US"/>
               </w:rPr>
-              <w:t>${nama_penguji_iv}</w:t>
+              <w:t xml:space="preserve"/>
+            </w:r>
+            <w:r>
+              <w:rPr>
+                <w:color w:val="000000" w:themeColor="text1"/>
+                <w:sz w:val="24"/>
+                <w:szCs w:val="24"/>
+              </w:rPr>
+              <w:t/>
+            </w:r>
+            <w:r>
+              <w:rPr>
+                <w:color w:val="000000" w:themeColor="text1"/>
+                <w:sz w:val="24"/>
+                <w:szCs w:val="24"/>
+                <w:lang w:val="en-US"/>
+              </w:rPr>
+              <w:t/>
             </w:r>
           </w:p>
         </w:tc>
@@ -3712,11 +4304,35 @@
             <w:r>
               <w:rPr>
                 <w:color w:val="000000" w:themeColor="text1"/>
-                <w:spacing w:val="-2"/>
-                <w:sz w:val="24"/>
+                <w:spacing w:val="-10"/>
+              </w:rPr>
+              <w:t>${nama_penguji_i}</w:t>
+            </w:r>
+            <w:r>
+              <w:rPr>
+                <w:color w:val="000000" w:themeColor="text1"/>
+                <w:sz w:val="24"/>
+                <w:szCs w:val="24"/>
                 <w:lang w:val="en-US"/>
               </w:rPr>
-              <w:t>…………………</w:t>
+              <w:t xml:space="preserve"/>
+            </w:r>
+            <w:r>
+              <w:rPr>
+                <w:color w:val="000000" w:themeColor="text1"/>
+                <w:sz w:val="24"/>
+                <w:szCs w:val="24"/>
+              </w:rPr>
+              <w:t/>
+            </w:r>
+            <w:r>
+              <w:rPr>
+                <w:color w:val="000000" w:themeColor="text1"/>
+                <w:sz w:val="24"/>
+                <w:szCs w:val="24"/>
+                <w:lang w:val="en-US"/>
+              </w:rPr>
+              <w:t/>
             </w:r>
             <w:r>
               <w:rPr>
@@ -3833,11 +4449,35 @@
             <w:r>
               <w:rPr>
                 <w:color w:val="000000" w:themeColor="text1"/>
-                <w:spacing w:val="-2"/>
-                <w:sz w:val="24"/>
+                <w:spacing w:val="-10"/>
+              </w:rPr>
+              <w:t>${nama_penguji_i}</w:t>
+            </w:r>
+            <w:r>
+              <w:rPr>
+                <w:color w:val="000000" w:themeColor="text1"/>
+                <w:sz w:val="24"/>
+                <w:szCs w:val="24"/>
                 <w:lang w:val="en-US"/>
               </w:rPr>
-              <w:t>…………………….</w:t>
+              <w:t xml:space="preserve"/>
+            </w:r>
+            <w:r>
+              <w:rPr>
+                <w:color w:val="000000" w:themeColor="text1"/>
+                <w:sz w:val="24"/>
+                <w:szCs w:val="24"/>
+              </w:rPr>
+              <w:t/>
+            </w:r>
+            <w:r>
+              <w:rPr>
+                <w:color w:val="000000" w:themeColor="text1"/>
+                <w:sz w:val="24"/>
+                <w:szCs w:val="24"/>
+                <w:lang w:val="en-US"/>
+              </w:rPr>
+              <w:t/>
             </w:r>
           </w:p>
         </w:tc>
@@ -3960,14 +4600,34 @@
         </w:rPr>
         <w:t xml:space="preserve"> </w:t>
       </w:r>
+      <w:proofErr w:type="spellStart"/>
       <w:r>
         <w:rPr>
           <w:rFonts w:ascii="Times New Roman" w:hAnsi="Times New Roman" w:cs="Times New Roman"/>
           <w:color w:val="000000" w:themeColor="text1"/>
           <w:spacing w:val="-2"/>
         </w:rPr>
-        <w:t>tgl create penilaian</w:t>
-      </w:r>
+        <w:t>tgl</w:t>
+      </w:r>
+      <w:proofErr w:type="spellEnd"/>
+      <w:r>
+        <w:rPr>
+          <w:rFonts w:ascii="Times New Roman" w:hAnsi="Times New Roman" w:cs="Times New Roman"/>
+          <w:color w:val="000000" w:themeColor="text1"/>
+          <w:spacing w:val="-2"/>
+        </w:rPr>
+        <w:t xml:space="preserve"> create </w:t>
+      </w:r>
+      <w:proofErr w:type="spellStart"/>
+      <w:r>
+        <w:rPr>
+          <w:rFonts w:ascii="Times New Roman" w:hAnsi="Times New Roman" w:cs="Times New Roman"/>
+          <w:color w:val="000000" w:themeColor="text1"/>
+          <w:spacing w:val="-2"/>
+        </w:rPr>
+        <w:t>penilaian</w:t>
+      </w:r>
+      <w:proofErr w:type="spellEnd"/>
     </w:p>
     <w:p>
       <w:pPr>
@@ -3981,6 +4641,7 @@
           <w:color w:val="000000" w:themeColor="text1"/>
         </w:rPr>
       </w:pPr>
+      <w:proofErr w:type="spellStart"/>
       <w:r>
         <w:rPr>
           <w:rFonts w:ascii="Times New Roman" w:hAnsi="Times New Roman" w:cs="Times New Roman"/>
@@ -3988,6 +4649,7 @@
         </w:rPr>
         <w:t>Ketua</w:t>
       </w:r>
+      <w:proofErr w:type="spellEnd"/>
       <w:r>
         <w:rPr>
           <w:rFonts w:ascii="Times New Roman" w:hAnsi="Times New Roman" w:cs="Times New Roman"/>
@@ -4025,8 +4687,16 @@
           <w:color w:val="000000" w:themeColor="text1"/>
         </w:rPr>
         <w:tab/>
+      </w:r>
+      <w:proofErr w:type="spellStart"/>
+      <w:r>
+        <w:rPr>
+          <w:rFonts w:ascii="Times New Roman" w:hAnsi="Times New Roman" w:cs="Times New Roman"/>
+          <w:color w:val="000000" w:themeColor="text1"/>
+        </w:rPr>
         <w:t>Ketua</w:t>
       </w:r>
+      <w:proofErr w:type="spellEnd"/>
       <w:r>
         <w:rPr>
           <w:rFonts w:ascii="Times New Roman" w:hAnsi="Times New Roman" w:cs="Times New Roman"/>
@@ -4050,13 +4720,23 @@
         </w:rPr>
         <w:t xml:space="preserve"> </w:t>
       </w:r>
+      <w:proofErr w:type="spellStart"/>
       <w:r>
         <w:rPr>
           <w:rFonts w:ascii="Times New Roman" w:hAnsi="Times New Roman" w:cs="Times New Roman"/>
           <w:color w:val="000000" w:themeColor="text1"/>
           <w:spacing w:val="-2"/>
         </w:rPr>
-        <w:t>Doktor,</w:t>
+        <w:t>Doktor</w:t>
+      </w:r>
+      <w:proofErr w:type="spellEnd"/>
+      <w:r>
+        <w:rPr>
+          <w:rFonts w:ascii="Times New Roman" w:hAnsi="Times New Roman" w:cs="Times New Roman"/>
+          <w:color w:val="000000" w:themeColor="text1"/>
+          <w:spacing w:val="-2"/>
+        </w:rPr>
+        <w:t>,</w:t>
       </w:r>
     </w:p>
     <w:p>

</xml_diff>

<commit_message>
fix(sidang): add lulus box logic and update BA template for final defense
</commit_message>
<xml_diff>
--- a/template/SIDANG/BA sidang akhir TEMPLATE.docx
+++ b/template/SIDANG/BA sidang akhir TEMPLATE.docx
@@ -3151,134 +3151,115 @@
     </w:p>
     <w:p>
       <w:pPr>
-        <w:pStyle w:val="ListParagraph"/>
         <w:widowControl w:val="0"/>
-        <w:numPr>
-          <w:ilvl w:val="0"/>
-          <w:numId w:val="8"/>
-        </w:numPr>
         <w:tabs>
           <w:tab w:val="left" w:pos="450"/>
         </w:tabs>
         <w:autoSpaceDE w:val="0"/>
         <w:autoSpaceDN w:val="0"/>
         <w:spacing w:before="146"/>
-        <w:ind w:left="2227" w:hanging="2047"/>
-        <w:contextualSpacing w:val="0"/>
-        <w:rPr>
-          <w:color w:val="000000" w:themeColor="text1"/>
-        </w:rPr>
-      </w:pPr>
-      <w:r>
-        <w:rPr>
-          <w:color w:val="000000" w:themeColor="text1"/>
-        </w:rPr>
-        <w:t xml:space="preserve">LULUS Sidang </w:t>
-      </w:r>
-      <w:proofErr w:type="spellStart"/>
-      <w:r>
-        <w:rPr>
-          <w:color w:val="000000" w:themeColor="text1"/>
-        </w:rPr>
-        <w:t>Doktor</w:t>
-      </w:r>
-      <w:proofErr w:type="spellEnd"/>
-      <w:r>
-        <w:rPr>
-          <w:color w:val="000000" w:themeColor="text1"/>
-        </w:rPr>
-        <w:t xml:space="preserve">, </w:t>
-      </w:r>
-      <w:proofErr w:type="spellStart"/>
-      <w:r>
-        <w:rPr>
-          <w:color w:val="000000" w:themeColor="text1"/>
-        </w:rPr>
-        <w:t>dengan</w:t>
-      </w:r>
-      <w:proofErr w:type="spellEnd"/>
-      <w:r>
-        <w:rPr>
-          <w:color w:val="000000" w:themeColor="text1"/>
-        </w:rPr>
-        <w:t xml:space="preserve"> usulan Nilai Akhir:</w:t>
+        <w:rPr>
+          <w:color w:val="000000" w:themeColor="text1"/>
+          <w:lang w:val="fi-FI"/>
+        </w:rPr>
+      </w:pPr>
+      <w:r>
+        <w:rPr>
+          <w:color w:val="000000" w:themeColor="text1"/>
+          <w:lang w:val="fi-FI"/>
+        </w:rPr>
+        <w:t>${kotak_lulus}</w:t>
+      </w:r>
+      <w:r>
+        <w:rPr>
+          <w:color w:val="000000" w:themeColor="text1"/>
+          <w:lang w:val="fi-FI"/>
+        </w:rPr>
+        <w:t xml:space="preserve"> </w:t>
+      </w:r>
+      <w:r>
+        <w:rPr>
+          <w:color w:val="000000" w:themeColor="text1"/>
+          <w:lang w:val="fi-FI"/>
+        </w:rPr>
+        <w:t>LULUS Sidang Doktor, dengan usulan Nilai Akhir:</w:t>
       </w:r>
     </w:p>
     <w:p>
       <w:pPr>
-        <w:pStyle w:val="ListParagraph"/>
         <w:widowControl w:val="0"/>
-        <w:numPr>
-          <w:ilvl w:val="0"/>
-          <w:numId w:val="8"/>
-        </w:numPr>
         <w:tabs>
           <w:tab w:val="left" w:pos="450"/>
         </w:tabs>
         <w:autoSpaceDE w:val="0"/>
         <w:autoSpaceDN w:val="0"/>
         <w:spacing w:before="146"/>
-        <w:ind w:left="2227" w:hanging="2047"/>
-        <w:contextualSpacing w:val="0"/>
-        <w:rPr>
-          <w:color w:val="000000" w:themeColor="text1"/>
-        </w:rPr>
-      </w:pPr>
-      <w:r>
-        <w:rPr>
-          <w:color w:val="000000" w:themeColor="text1"/>
-        </w:rPr>
-        <w:t xml:space="preserve">dan </w:t>
-      </w:r>
-      <w:proofErr w:type="spellStart"/>
-      <w:r>
-        <w:rPr>
-          <w:color w:val="000000" w:themeColor="text1"/>
-        </w:rPr>
-        <w:t>Rekomendasi</w:t>
-      </w:r>
-      <w:proofErr w:type="spellEnd"/>
-      <w:r>
-        <w:rPr>
-          <w:color w:val="000000" w:themeColor="text1"/>
-        </w:rPr>
-        <w:t xml:space="preserve"> </w:t>
-      </w:r>
-      <w:proofErr w:type="spellStart"/>
-      <w:r>
-        <w:rPr>
-          <w:color w:val="000000" w:themeColor="text1"/>
-        </w:rPr>
-        <w:t>Yudisium</w:t>
-      </w:r>
-      <w:proofErr w:type="spellEnd"/>
-      <w:r>
-        <w:rPr>
-          <w:color w:val="000000" w:themeColor="text1"/>
-        </w:rPr>
-        <w:t>: ……………………….</w:t>
+        <w:rPr>
+          <w:color w:val="000000" w:themeColor="text1"/>
+          <w:lang w:val="fi-FI"/>
+        </w:rPr>
+      </w:pPr>
+      <w:r>
+        <w:rPr>
+          <w:color w:val="000000" w:themeColor="text1"/>
+          <w:lang w:val="fi-FI"/>
+        </w:rPr>
+        <w:t>${kotak_yudisium}</w:t>
+      </w:r>
+      <w:r>
+        <w:rPr>
+          <w:color w:val="000000" w:themeColor="text1"/>
+          <w:lang w:val="fi-FI"/>
+        </w:rPr>
+        <w:t xml:space="preserve"> </w:t>
+      </w:r>
+      <w:r>
+        <w:rPr>
+          <w:color w:val="000000" w:themeColor="text1"/>
+          <w:lang w:val="fi-FI"/>
+        </w:rPr>
+        <w:t>dan Rekomendasi Yudisium: ……………………….</w:t>
       </w:r>
     </w:p>
     <w:p>
       <w:pPr>
-        <w:pStyle w:val="ListParagraph"/>
         <w:widowControl w:val="0"/>
-        <w:numPr>
-          <w:ilvl w:val="0"/>
-          <w:numId w:val="8"/>
-        </w:numPr>
         <w:tabs>
           <w:tab w:val="left" w:pos="450"/>
         </w:tabs>
         <w:autoSpaceDE w:val="0"/>
         <w:autoSpaceDN w:val="0"/>
         <w:spacing w:before="146"/>
-        <w:ind w:left="2227" w:hanging="2047"/>
-        <w:contextualSpacing w:val="0"/>
-        <w:rPr>
-          <w:color w:val="000000" w:themeColor="text1"/>
-        </w:rPr>
-      </w:pPr>
+        <w:rPr>
+          <w:color w:val="000000" w:themeColor="text1"/>
+        </w:rPr>
+      </w:pPr>
+      <w:r>
+        <w:rPr>
+          <w:color w:val="000000" w:themeColor="text1"/>
+        </w:rPr>
+        <w:t>${kotak_tidak_lulus}</w:t>
+      </w:r>
+      <w:proofErr w:type="spellStart"/>
+      <w:r>
+        <w:rPr>
+          <w:color w:val="000000" w:themeColor="text1"/>
+        </w:rPr>
+        <w:t/>
+      </w:r>
+      <w:proofErr w:type="spellEnd"/>
+      <w:r>
+        <w:rPr>
+          <w:color w:val="000000" w:themeColor="text1"/>
+        </w:rPr>
+        <w:t/>
+      </w:r>
+      <w:r>
+        <w:rPr>
+          <w:color w:val="000000" w:themeColor="text1"/>
+        </w:rPr>
+        <w:t xml:space="preserve"> </w:t>
+      </w:r>
       <w:r>
         <w:rPr>
           <w:color w:val="000000" w:themeColor="text1"/>
@@ -6677,7 +6658,6 @@
   <w:style w:type="character" w:default="1" w:styleId="DefaultParagraphFont">
     <w:name w:val="Default Paragraph Font"/>
     <w:uiPriority w:val="1"/>
-    <w:semiHidden/>
     <w:unhideWhenUsed/>
   </w:style>
   <w:style w:type="table" w:default="1" w:styleId="TableNormal">

</xml_diff>

<commit_message>
feat(controller): update CetakController to enhance formatting of notes and student names in final session reports; improve line spacing in generated documents and ensure consistent handling of line breaks
</commit_message>
<xml_diff>
--- a/template/SIDANG/BA sidang akhir TEMPLATE.docx
+++ b/template/SIDANG/BA sidang akhir TEMPLATE.docx
@@ -1,6 +1,6 @@
 
 <file path=word/document.xml><?xml version="1.0" encoding="utf-8"?>
-<w:document xmlns:wpc="http://schemas.microsoft.com/office/word/2010/wordprocessingCanvas" xmlns:cx="http://schemas.microsoft.com/office/drawing/2014/chartex" xmlns:cx1="http://schemas.microsoft.com/office/drawing/2015/9/8/chartex" xmlns:cx2="http://schemas.microsoft.com/office/drawing/2015/10/21/chartex" xmlns:cx3="http://schemas.microsoft.com/office/drawing/2016/5/9/chartex" xmlns:cx4="http://schemas.microsoft.com/office/drawing/2016/5/10/chartex" xmlns:cx5="http://schemas.microsoft.com/office/drawing/2016/5/11/chartex" xmlns:cx6="http://schemas.microsoft.com/office/drawing/2016/5/12/chartex" xmlns:cx7="http://schemas.microsoft.com/office/drawing/2016/5/13/chartex" xmlns:cx8="http://schemas.microsoft.com/office/drawing/2016/5/14/chartex" xmlns:mc="http://schemas.openxmlformats.org/markup-compatibility/2006" xmlns:aink="http://schemas.microsoft.com/office/drawing/2016/ink" xmlns:am3d="http://schemas.microsoft.com/office/drawing/2017/model3d" xmlns:o="urn:schemas-microsoft-com:office:office" xmlns:oel="http://schemas.microsoft.com/office/2019/extlst" xmlns:r="http://schemas.openxmlformats.org/officeDocument/2006/relationships" xmlns:m="http://schemas.openxmlformats.org/officeDocument/2006/math" xmlns:v="urn:schemas-microsoft-com:vml" xmlns:wp14="http://schemas.microsoft.com/office/word/2010/wordprocessingDrawing" xmlns:wp="http://schemas.openxmlformats.org/drawingml/2006/wordprocessingDrawing" xmlns:w10="urn:schemas-microsoft-com:office:word" xmlns:w="http://schemas.openxmlformats.org/wordprocessingml/2006/main" xmlns:w14="http://schemas.microsoft.com/office/word/2010/wordml" xmlns:w15="http://schemas.microsoft.com/office/word/2012/wordml" xmlns:w16cex="http://schemas.microsoft.com/office/word/2018/wordml/cex" xmlns:w16cid="http://schemas.microsoft.com/office/word/2016/wordml/cid" xmlns:w16="http://schemas.microsoft.com/office/word/2018/wordml" xmlns:w16du="http://schemas.microsoft.com/office/word/2023/wordml/word16du" xmlns:w16sdtdh="http://schemas.microsoft.com/office/word/2020/wordml/sdtdatahash" xmlns:w16sdtfl="http://schemas.microsoft.com/office/word/2024/wordml/sdtformatlock" xmlns:w16se="http://schemas.microsoft.com/office/word/2015/wordml/symex" xmlns:wpg="http://schemas.microsoft.com/office/word/2010/wordprocessingGroup" xmlns:wpi="http://schemas.microsoft.com/office/word/2010/wordprocessingInk" xmlns:wne="http://schemas.microsoft.com/office/word/2006/wordml" xmlns:wps="http://schemas.microsoft.com/office/word/2010/wordprocessingShape" mc:Ignorable="w14 w15 w16se w16cid w16 w16cex w16sdtdh w16sdtfl w16du wp14">
+<w:document xmlns:wpc="http://schemas.microsoft.com/office/word/2010/wordprocessingCanvas" xmlns:cx="http://schemas.microsoft.com/office/drawing/2014/chartex" xmlns:mc="http://schemas.openxmlformats.org/markup-compatibility/2006" xmlns:o="urn:schemas-microsoft-com:office:office" xmlns:r="http://schemas.openxmlformats.org/officeDocument/2006/relationships" xmlns:m="http://schemas.openxmlformats.org/officeDocument/2006/math" xmlns:v="urn:schemas-microsoft-com:vml" xmlns:wp14="http://schemas.microsoft.com/office/word/2010/wordprocessingDrawing" xmlns:wp="http://schemas.openxmlformats.org/drawingml/2006/wordprocessingDrawing" xmlns:w10="urn:schemas-microsoft-com:office:word" xmlns:w="http://schemas.openxmlformats.org/wordprocessingml/2006/main" xmlns:w14="http://schemas.microsoft.com/office/word/2010/wordml" xmlns:w15="http://schemas.microsoft.com/office/word/2012/wordml" xmlns:w16se="http://schemas.microsoft.com/office/word/2015/wordml/symex" xmlns:wpg="http://schemas.microsoft.com/office/word/2010/wordprocessingGroup" xmlns:wpi="http://schemas.microsoft.com/office/word/2010/wordprocessingInk" xmlns:wne="http://schemas.microsoft.com/office/word/2006/wordml" xmlns:wps="http://schemas.microsoft.com/office/word/2010/wordprocessingShape" mc:Ignorable="w14 w15 w16se wp14">
   <w:body>
     <w:p>
       <w:pPr>
@@ -218,6 +218,28 @@
         </w:rPr>
         <w:t>${nama_mhs}</w:t>
       </w:r>
+      <w:r>
+        <w:rPr>
+          <w:rFonts w:ascii="Times New Roman" w:hAnsi="Times New Roman" w:cs="Times New Roman"/>
+          <w:b/>
+          <w:bCs/>
+          <w:color w:val="000000" w:themeColor="text1"/>
+          <w:spacing w:val="-10"/>
+        </w:rPr>
+        <w:t/>
+      </w:r>
+      <w:proofErr w:type="spellStart"/>
+      <w:r>
+        <w:rPr>
+          <w:rFonts w:ascii="Times New Roman" w:hAnsi="Times New Roman" w:cs="Times New Roman"/>
+          <w:b/>
+          <w:bCs/>
+          <w:color w:val="000000" w:themeColor="text1"/>
+          <w:spacing w:val="-10"/>
+        </w:rPr>
+        <w:t/>
+      </w:r>
+      <w:proofErr w:type="spellEnd"/>
       <w:r>
         <w:rPr>
           <w:rFonts w:ascii="Times New Roman" w:hAnsi="Times New Roman" w:cs="Times New Roman"/>
@@ -1870,6 +1892,7 @@
         </w:rPr>
         <w:t xml:space="preserve"> </w:t>
       </w:r>
+      <w:proofErr w:type="spellStart"/>
       <w:r>
         <w:rPr>
           <w:rFonts w:ascii="Times New Roman" w:hAnsi="Times New Roman" w:cs="Times New Roman"/>
@@ -1877,6 +1900,7 @@
         </w:rPr>
         <w:t>Kuliah</w:t>
       </w:r>
+      <w:proofErr w:type="spellEnd"/>
       <w:r>
         <w:rPr>
           <w:rFonts w:ascii="Times New Roman" w:hAnsi="Times New Roman" w:cs="Times New Roman"/>
@@ -1900,6 +1924,7 @@
         </w:rPr>
         <w:t xml:space="preserve"> </w:t>
       </w:r>
+      <w:proofErr w:type="spellStart"/>
       <w:r>
         <w:rPr>
           <w:rFonts w:ascii="Times New Roman" w:hAnsi="Times New Roman" w:cs="Times New Roman"/>
@@ -1907,6 +1932,7 @@
         </w:rPr>
         <w:t>Sidang</w:t>
       </w:r>
+      <w:proofErr w:type="spellEnd"/>
       <w:r>
         <w:rPr>
           <w:rFonts w:ascii="Times New Roman" w:hAnsi="Times New Roman" w:cs="Times New Roman"/>
@@ -2564,7 +2590,6 @@
         </w:rPr>
         <w:tab/>
       </w:r>
-      <w:proofErr w:type="gramStart"/>
       <w:r>
         <w:rPr>
           <w:color w:val="000000" w:themeColor="text1"/>
@@ -2585,13 +2610,6 @@
           <w:color w:val="000000" w:themeColor="text1"/>
         </w:rPr>
         <w:t>${jml_jurnal_q1}</w:t>
-      </w:r>
-      <w:proofErr w:type="gramEnd"/>
-      <w:r>
-        <w:rPr>
-          <w:color w:val="000000" w:themeColor="text1"/>
-        </w:rPr>
-        <w:t/>
       </w:r>
       <w:r>
         <w:rPr>
@@ -2744,7 +2762,6 @@
         </w:rPr>
         <w:tab/>
       </w:r>
-      <w:proofErr w:type="gramStart"/>
       <w:r>
         <w:rPr>
           <w:color w:val="000000" w:themeColor="text1"/>
@@ -2765,13 +2782,6 @@
           <w:color w:val="000000" w:themeColor="text1"/>
         </w:rPr>
         <w:t>${jml_jurnal_bereputasi1}</w:t>
-      </w:r>
-      <w:proofErr w:type="gramEnd"/>
-      <w:r>
-        <w:rPr>
-          <w:color w:val="000000" w:themeColor="text1"/>
-        </w:rPr>
-        <w:t/>
       </w:r>
     </w:p>
     <w:p>
@@ -3238,7 +3248,7 @@
         <w:rPr>
           <w:color w:val="000000" w:themeColor="text1"/>
         </w:rPr>
-        <w:t>${kotak_tidak_lulus}</w:t>
+        <w:t>${kotak_lulus}</w:t>
       </w:r>
       <w:proofErr w:type="spellStart"/>
       <w:r>
@@ -3260,17 +3270,39 @@
         </w:rPr>
         <w:t xml:space="preserve"> </w:t>
       </w:r>
-      <w:r>
-        <w:rPr>
-          <w:color w:val="000000" w:themeColor="text1"/>
-        </w:rPr>
-        <w:t xml:space="preserve">Tidak Lulus Sidang </w:t>
-      </w:r>
       <w:proofErr w:type="spellStart"/>
       <w:r>
         <w:rPr>
           <w:color w:val="000000" w:themeColor="text1"/>
         </w:rPr>
+        <w:t>Tidak</w:t>
+      </w:r>
+      <w:proofErr w:type="spellEnd"/>
+      <w:r>
+        <w:rPr>
+          <w:color w:val="000000" w:themeColor="text1"/>
+        </w:rPr>
+        <w:t xml:space="preserve"> Lulus </w:t>
+      </w:r>
+      <w:proofErr w:type="spellStart"/>
+      <w:r>
+        <w:rPr>
+          <w:color w:val="000000" w:themeColor="text1"/>
+        </w:rPr>
+        <w:t>Sidang</w:t>
+      </w:r>
+      <w:proofErr w:type="spellEnd"/>
+      <w:r>
+        <w:rPr>
+          <w:color w:val="000000" w:themeColor="text1"/>
+        </w:rPr>
+        <w:t xml:space="preserve"> </w:t>
+      </w:r>
+      <w:proofErr w:type="spellStart"/>
+      <w:r>
+        <w:rPr>
+          <w:color w:val="000000" w:themeColor="text1"/>
+        </w:rPr>
         <w:t>Doktor</w:t>
       </w:r>
       <w:proofErr w:type="spellEnd"/>
@@ -3278,13 +3310,41 @@
         <w:rPr>
           <w:color w:val="000000" w:themeColor="text1"/>
         </w:rPr>
-        <w:t xml:space="preserve"> dan harus </w:t>
+        <w:t xml:space="preserve"> </w:t>
       </w:r>
       <w:proofErr w:type="spellStart"/>
       <w:r>
         <w:rPr>
           <w:color w:val="000000" w:themeColor="text1"/>
         </w:rPr>
+        <w:t>dan</w:t>
+      </w:r>
+      <w:proofErr w:type="spellEnd"/>
+      <w:r>
+        <w:rPr>
+          <w:color w:val="000000" w:themeColor="text1"/>
+        </w:rPr>
+        <w:t xml:space="preserve"> </w:t>
+      </w:r>
+      <w:proofErr w:type="spellStart"/>
+      <w:r>
+        <w:rPr>
+          <w:color w:val="000000" w:themeColor="text1"/>
+        </w:rPr>
+        <w:t>harus</w:t>
+      </w:r>
+      <w:proofErr w:type="spellEnd"/>
+      <w:r>
+        <w:rPr>
+          <w:color w:val="000000" w:themeColor="text1"/>
+        </w:rPr>
+        <w:t xml:space="preserve"> </w:t>
+      </w:r>
+      <w:proofErr w:type="spellStart"/>
+      <w:r>
+        <w:rPr>
+          <w:color w:val="000000" w:themeColor="text1"/>
+        </w:rPr>
         <w:t>mengulang</w:t>
       </w:r>
       <w:proofErr w:type="spellEnd"/>
@@ -3292,7 +3352,21 @@
         <w:rPr>
           <w:color w:val="000000" w:themeColor="text1"/>
         </w:rPr>
-        <w:t xml:space="preserve"> Sidang </w:t>
+        <w:t xml:space="preserve"> </w:t>
+      </w:r>
+      <w:proofErr w:type="spellStart"/>
+      <w:r>
+        <w:rPr>
+          <w:color w:val="000000" w:themeColor="text1"/>
+        </w:rPr>
+        <w:t>Sidang</w:t>
+      </w:r>
+      <w:proofErr w:type="spellEnd"/>
+      <w:r>
+        <w:rPr>
+          <w:color w:val="000000" w:themeColor="text1"/>
+        </w:rPr>
+        <w:t xml:space="preserve"> </w:t>
       </w:r>
       <w:proofErr w:type="spellStart"/>
       <w:r>
@@ -3519,6 +3593,7 @@
                 <w:b/>
                 <w:color w:val="000000" w:themeColor="text1"/>
                 <w:sz w:val="24"/>
+                <w:szCs w:val="24"/>
               </w:rPr>
             </w:pPr>
             <w:r>
@@ -3526,6 +3601,7 @@
                 <w:b/>
                 <w:color w:val="000000" w:themeColor="text1"/>
                 <w:sz w:val="24"/>
+                <w:szCs w:val="24"/>
               </w:rPr>
               <w:t>Tim</w:t>
             </w:r>
@@ -3535,6 +3611,7 @@
                 <w:color w:val="000000" w:themeColor="text1"/>
                 <w:spacing w:val="1"/>
                 <w:sz w:val="24"/>
+                <w:szCs w:val="24"/>
               </w:rPr>
               <w:t xml:space="preserve"> </w:t>
             </w:r>
@@ -3544,6 +3621,7 @@
                 <w:color w:val="000000" w:themeColor="text1"/>
                 <w:spacing w:val="-2"/>
                 <w:sz w:val="24"/>
+                <w:szCs w:val="24"/>
               </w:rPr>
               <w:t>Penguji:</w:t>
             </w:r>
@@ -3560,6 +3638,7 @@
               <w:rPr>
                 <w:color w:val="000000" w:themeColor="text1"/>
                 <w:sz w:val="24"/>
+                <w:szCs w:val="24"/>
               </w:rPr>
             </w:pPr>
           </w:p>
@@ -3579,6 +3658,7 @@
                 <w:b/>
                 <w:color w:val="000000" w:themeColor="text1"/>
                 <w:sz w:val="24"/>
+                <w:szCs w:val="24"/>
               </w:rPr>
             </w:pPr>
             <w:r>
@@ -3586,6 +3666,7 @@
                 <w:b/>
                 <w:color w:val="000000" w:themeColor="text1"/>
                 <w:sz w:val="24"/>
+                <w:szCs w:val="24"/>
               </w:rPr>
               <w:t>Tanda</w:t>
             </w:r>
@@ -3595,6 +3676,7 @@
                 <w:color w:val="000000" w:themeColor="text1"/>
                 <w:spacing w:val="-4"/>
                 <w:sz w:val="24"/>
+                <w:szCs w:val="24"/>
               </w:rPr>
               <w:t xml:space="preserve"> </w:t>
             </w:r>
@@ -3604,6 +3686,7 @@
                 <w:color w:val="000000" w:themeColor="text1"/>
                 <w:spacing w:val="-2"/>
                 <w:sz w:val="24"/>
+                <w:szCs w:val="24"/>
               </w:rPr>
               <w:t>Tangan</w:t>
             </w:r>
@@ -3626,12 +3709,14 @@
               <w:rPr>
                 <w:color w:val="000000" w:themeColor="text1"/>
                 <w:sz w:val="24"/>
+                <w:szCs w:val="24"/>
               </w:rPr>
             </w:pPr>
             <w:r>
               <w:rPr>
                 <w:color w:val="000000" w:themeColor="text1"/>
                 <w:sz w:val="24"/>
+                <w:szCs w:val="24"/>
               </w:rPr>
               <w:t>1</w:t>
             </w:r>
@@ -3650,22 +3735,17 @@
               <w:rPr>
                 <w:color w:val="000000" w:themeColor="text1"/>
                 <w:sz w:val="24"/>
+                <w:szCs w:val="24"/>
               </w:rPr>
             </w:pPr>
             <w:r>
               <w:rPr>
                 <w:color w:val="000000" w:themeColor="text1"/>
                 <w:spacing w:val="-10"/>
+                <w:sz w:val="24"/>
+                <w:szCs w:val="24"/>
               </w:rPr>
               <w:t>${nama_ketua_pembimbing}</w:t>
-            </w:r>
-            <w:r>
-              <w:rPr>
-                <w:color w:val="000000" w:themeColor="text1"/>
-                <w:sz w:val="24"/>
-                <w:szCs w:val="24"/>
-              </w:rPr>
-              <w:t xml:space="preserve"/>
             </w:r>
             <w:r>
               <w:rPr>
@@ -3717,12 +3797,14 @@
               <w:rPr>
                 <w:color w:val="000000" w:themeColor="text1"/>
                 <w:sz w:val="24"/>
+                <w:szCs w:val="24"/>
               </w:rPr>
             </w:pPr>
             <w:r>
               <w:rPr>
                 <w:color w:val="000000" w:themeColor="text1"/>
                 <w:sz w:val="24"/>
+                <w:szCs w:val="24"/>
               </w:rPr>
               <w:t>(Ketua</w:t>
             </w:r>
@@ -3731,6 +3813,7 @@
                 <w:color w:val="000000" w:themeColor="text1"/>
                 <w:spacing w:val="-6"/>
                 <w:sz w:val="24"/>
+                <w:szCs w:val="24"/>
               </w:rPr>
               <w:t xml:space="preserve"> </w:t>
             </w:r>
@@ -3739,6 +3822,7 @@
                 <w:color w:val="000000" w:themeColor="text1"/>
                 <w:spacing w:val="-5"/>
                 <w:sz w:val="24"/>
+                <w:szCs w:val="24"/>
               </w:rPr>
               <w:t xml:space="preserve">Tim </w:t>
             </w:r>
@@ -3747,6 +3831,7 @@
                 <w:color w:val="000000" w:themeColor="text1"/>
                 <w:spacing w:val="-2"/>
                 <w:sz w:val="24"/>
+                <w:szCs w:val="24"/>
               </w:rPr>
               <w:t>Pembimbing)</w:t>
             </w:r>
@@ -3766,6 +3851,7 @@
               <w:rPr>
                 <w:color w:val="000000" w:themeColor="text1"/>
                 <w:sz w:val="24"/>
+                <w:szCs w:val="24"/>
               </w:rPr>
             </w:pPr>
             <w:r>
@@ -3773,6 +3859,7 @@
                 <w:color w:val="000000" w:themeColor="text1"/>
                 <w:spacing w:val="-2"/>
                 <w:sz w:val="24"/>
+                <w:szCs w:val="24"/>
               </w:rPr>
               <w:t>${signature}</w:t>
             </w:r>
@@ -3795,12 +3882,14 @@
               <w:rPr>
                 <w:color w:val="000000" w:themeColor="text1"/>
                 <w:sz w:val="24"/>
+                <w:szCs w:val="24"/>
               </w:rPr>
             </w:pPr>
             <w:r>
               <w:rPr>
                 <w:color w:val="000000" w:themeColor="text1"/>
                 <w:sz w:val="24"/>
+                <w:szCs w:val="24"/>
               </w:rPr>
               <w:t>2</w:t>
             </w:r>
@@ -3819,12 +3908,15 @@
               <w:rPr>
                 <w:color w:val="000000" w:themeColor="text1"/>
                 <w:sz w:val="24"/>
+                <w:szCs w:val="24"/>
               </w:rPr>
             </w:pPr>
             <w:r>
               <w:rPr>
                 <w:color w:val="000000" w:themeColor="text1"/>
                 <w:spacing w:val="-10"/>
+                <w:sz w:val="24"/>
+                <w:szCs w:val="24"/>
               </w:rPr>
               <w:t>${nama_pembimbing_i}</w:t>
             </w:r>
@@ -3887,12 +3979,14 @@
               <w:rPr>
                 <w:color w:val="000000" w:themeColor="text1"/>
                 <w:sz w:val="24"/>
+                <w:szCs w:val="24"/>
               </w:rPr>
             </w:pPr>
             <w:r>
               <w:rPr>
                 <w:color w:val="000000" w:themeColor="text1"/>
                 <w:sz w:val="24"/>
+                <w:szCs w:val="24"/>
               </w:rPr>
               <w:t>(Ko-Pembimbing</w:t>
             </w:r>
@@ -3901,6 +3995,7 @@
                 <w:color w:val="000000" w:themeColor="text1"/>
                 <w:spacing w:val="-8"/>
                 <w:sz w:val="24"/>
+                <w:szCs w:val="24"/>
               </w:rPr>
               <w:t xml:space="preserve"> </w:t>
             </w:r>
@@ -3909,6 +4004,7 @@
                 <w:color w:val="000000" w:themeColor="text1"/>
                 <w:spacing w:val="-5"/>
                 <w:sz w:val="24"/>
+                <w:szCs w:val="24"/>
               </w:rPr>
               <w:t>1)</w:t>
             </w:r>
@@ -3928,6 +4024,7 @@
               <w:rPr>
                 <w:color w:val="000000" w:themeColor="text1"/>
                 <w:sz w:val="24"/>
+                <w:szCs w:val="24"/>
               </w:rPr>
             </w:pPr>
             <w:r>
@@ -3935,6 +4032,7 @@
                 <w:color w:val="000000" w:themeColor="text1"/>
                 <w:spacing w:val="-2"/>
                 <w:sz w:val="24"/>
+                <w:szCs w:val="24"/>
               </w:rPr>
               <w:t>${signature}</w:t>
             </w:r>
@@ -3957,12 +4055,14 @@
               <w:rPr>
                 <w:color w:val="000000" w:themeColor="text1"/>
                 <w:sz w:val="24"/>
+                <w:szCs w:val="24"/>
               </w:rPr>
             </w:pPr>
             <w:r>
               <w:rPr>
                 <w:color w:val="000000" w:themeColor="text1"/>
                 <w:sz w:val="24"/>
+                <w:szCs w:val="24"/>
               </w:rPr>
               <w:t>3</w:t>
             </w:r>
@@ -3981,12 +4081,15 @@
               <w:rPr>
                 <w:color w:val="000000" w:themeColor="text1"/>
                 <w:sz w:val="24"/>
+                <w:szCs w:val="24"/>
               </w:rPr>
             </w:pPr>
             <w:r>
               <w:rPr>
                 <w:color w:val="000000" w:themeColor="text1"/>
                 <w:spacing w:val="-10"/>
+                <w:sz w:val="24"/>
+                <w:szCs w:val="24"/>
               </w:rPr>
               <w:t>${nama_pembimbing_ii}</w:t>
             </w:r>
@@ -4049,12 +4152,14 @@
               <w:rPr>
                 <w:color w:val="000000" w:themeColor="text1"/>
                 <w:sz w:val="24"/>
+                <w:szCs w:val="24"/>
               </w:rPr>
             </w:pPr>
             <w:r>
               <w:rPr>
                 <w:color w:val="000000" w:themeColor="text1"/>
                 <w:sz w:val="24"/>
+                <w:szCs w:val="24"/>
               </w:rPr>
               <w:t>(Ko-Pembimbing</w:t>
             </w:r>
@@ -4063,6 +4168,7 @@
                 <w:color w:val="000000" w:themeColor="text1"/>
                 <w:spacing w:val="-8"/>
                 <w:sz w:val="24"/>
+                <w:szCs w:val="24"/>
               </w:rPr>
               <w:t xml:space="preserve"> </w:t>
             </w:r>
@@ -4071,6 +4177,7 @@
                 <w:color w:val="000000" w:themeColor="text1"/>
                 <w:spacing w:val="-5"/>
                 <w:sz w:val="24"/>
+                <w:szCs w:val="24"/>
               </w:rPr>
               <w:t>2)</w:t>
             </w:r>
@@ -4090,6 +4197,7 @@
               <w:rPr>
                 <w:color w:val="000000" w:themeColor="text1"/>
                 <w:sz w:val="24"/>
+                <w:szCs w:val="24"/>
               </w:rPr>
             </w:pPr>
             <w:r>
@@ -4097,6 +4205,7 @@
                 <w:color w:val="000000" w:themeColor="text1"/>
                 <w:spacing w:val="-2"/>
                 <w:sz w:val="24"/>
+                <w:szCs w:val="24"/>
               </w:rPr>
               <w:t>${signature}</w:t>
             </w:r>
@@ -4119,12 +4228,14 @@
               <w:rPr>
                 <w:color w:val="000000" w:themeColor="text1"/>
                 <w:sz w:val="24"/>
+                <w:szCs w:val="24"/>
               </w:rPr>
             </w:pPr>
             <w:r>
               <w:rPr>
                 <w:color w:val="000000" w:themeColor="text1"/>
                 <w:sz w:val="24"/>
+                <w:szCs w:val="24"/>
               </w:rPr>
               <w:t>4</w:t>
             </w:r>
@@ -4143,6 +4254,7 @@
               <w:rPr>
                 <w:color w:val="000000" w:themeColor="text1"/>
                 <w:sz w:val="24"/>
+                <w:szCs w:val="24"/>
                 <w:lang w:val="en-US"/>
               </w:rPr>
             </w:pPr>
@@ -4150,6 +4262,8 @@
               <w:rPr>
                 <w:color w:val="000000" w:themeColor="text1"/>
                 <w:spacing w:val="-10"/>
+                <w:sz w:val="24"/>
+                <w:szCs w:val="24"/>
               </w:rPr>
               <w:t>${nama_penguji_i}</w:t>
             </w:r>
@@ -4194,12 +4308,14 @@
               <w:rPr>
                 <w:color w:val="000000" w:themeColor="text1"/>
                 <w:sz w:val="24"/>
+                <w:szCs w:val="24"/>
               </w:rPr>
             </w:pPr>
             <w:r>
               <w:rPr>
                 <w:color w:val="000000" w:themeColor="text1"/>
                 <w:sz w:val="24"/>
+                <w:szCs w:val="24"/>
               </w:rPr>
               <w:t>(Penguji</w:t>
             </w:r>
@@ -4208,6 +4324,7 @@
                 <w:color w:val="000000" w:themeColor="text1"/>
                 <w:spacing w:val="-5"/>
                 <w:sz w:val="24"/>
+                <w:szCs w:val="24"/>
               </w:rPr>
               <w:t xml:space="preserve"> 1)</w:t>
             </w:r>
@@ -4227,6 +4344,7 @@
               <w:rPr>
                 <w:color w:val="000000" w:themeColor="text1"/>
                 <w:sz w:val="24"/>
+                <w:szCs w:val="24"/>
               </w:rPr>
             </w:pPr>
             <w:r>
@@ -4234,6 +4352,7 @@
                 <w:color w:val="000000" w:themeColor="text1"/>
                 <w:spacing w:val="-2"/>
                 <w:sz w:val="24"/>
+                <w:szCs w:val="24"/>
               </w:rPr>
               <w:t>${signature}</w:t>
             </w:r>
@@ -4256,12 +4375,14 @@
               <w:rPr>
                 <w:color w:val="000000" w:themeColor="text1"/>
                 <w:sz w:val="24"/>
+                <w:szCs w:val="24"/>
               </w:rPr>
             </w:pPr>
             <w:r>
               <w:rPr>
                 <w:color w:val="000000" w:themeColor="text1"/>
                 <w:sz w:val="24"/>
+                <w:szCs w:val="24"/>
               </w:rPr>
               <w:t>5</w:t>
             </w:r>
@@ -4280,12 +4401,15 @@
               <w:rPr>
                 <w:color w:val="000000" w:themeColor="text1"/>
                 <w:sz w:val="24"/>
+                <w:szCs w:val="24"/>
               </w:rPr>
             </w:pPr>
             <w:r>
               <w:rPr>
                 <w:color w:val="000000" w:themeColor="text1"/>
                 <w:spacing w:val="-10"/>
+                <w:sz w:val="24"/>
+                <w:szCs w:val="24"/>
               </w:rPr>
               <w:t>${nama_penguji_i}</w:t>
             </w:r>
@@ -4320,6 +4444,7 @@
                 <w:color w:val="000000" w:themeColor="text1"/>
                 <w:spacing w:val="-2"/>
                 <w:sz w:val="24"/>
+                <w:szCs w:val="24"/>
                 <w:lang w:val="en-US"/>
               </w:rPr>
               <w:t xml:space="preserve"> </w:t>
@@ -4339,12 +4464,14 @@
               <w:rPr>
                 <w:color w:val="000000" w:themeColor="text1"/>
                 <w:sz w:val="24"/>
+                <w:szCs w:val="24"/>
               </w:rPr>
             </w:pPr>
             <w:r>
               <w:rPr>
                 <w:color w:val="000000" w:themeColor="text1"/>
                 <w:sz w:val="24"/>
+                <w:szCs w:val="24"/>
               </w:rPr>
               <w:t>(Penguji</w:t>
             </w:r>
@@ -4353,6 +4480,7 @@
                 <w:color w:val="000000" w:themeColor="text1"/>
                 <w:spacing w:val="-5"/>
                 <w:sz w:val="24"/>
+                <w:szCs w:val="24"/>
               </w:rPr>
               <w:t xml:space="preserve"> 2)</w:t>
             </w:r>
@@ -4372,6 +4500,7 @@
               <w:rPr>
                 <w:color w:val="000000" w:themeColor="text1"/>
                 <w:sz w:val="24"/>
+                <w:szCs w:val="24"/>
               </w:rPr>
             </w:pPr>
             <w:r>
@@ -4379,6 +4508,7 @@
                 <w:color w:val="000000" w:themeColor="text1"/>
                 <w:spacing w:val="-2"/>
                 <w:sz w:val="24"/>
+                <w:szCs w:val="24"/>
               </w:rPr>
               <w:t>${signature}</w:t>
             </w:r>
@@ -4401,12 +4531,14 @@
               <w:rPr>
                 <w:color w:val="000000" w:themeColor="text1"/>
                 <w:sz w:val="24"/>
+                <w:szCs w:val="24"/>
               </w:rPr>
             </w:pPr>
             <w:r>
               <w:rPr>
                 <w:color w:val="000000" w:themeColor="text1"/>
                 <w:sz w:val="24"/>
+                <w:szCs w:val="24"/>
               </w:rPr>
               <w:t>6</w:t>
             </w:r>
@@ -4425,12 +4557,15 @@
               <w:rPr>
                 <w:color w:val="000000" w:themeColor="text1"/>
                 <w:sz w:val="24"/>
+                <w:szCs w:val="24"/>
               </w:rPr>
             </w:pPr>
             <w:r>
               <w:rPr>
                 <w:color w:val="000000" w:themeColor="text1"/>
                 <w:spacing w:val="-10"/>
+                <w:sz w:val="24"/>
+                <w:szCs w:val="24"/>
               </w:rPr>
               <w:t>${nama_penguji_i}</w:t>
             </w:r>
@@ -4475,12 +4610,14 @@
               <w:rPr>
                 <w:color w:val="000000" w:themeColor="text1"/>
                 <w:sz w:val="24"/>
+                <w:szCs w:val="24"/>
               </w:rPr>
             </w:pPr>
             <w:r>
               <w:rPr>
                 <w:color w:val="000000" w:themeColor="text1"/>
                 <w:sz w:val="24"/>
+                <w:szCs w:val="24"/>
               </w:rPr>
               <w:t>(Penguji</w:t>
             </w:r>
@@ -4489,6 +4626,7 @@
                 <w:color w:val="000000" w:themeColor="text1"/>
                 <w:spacing w:val="-5"/>
                 <w:sz w:val="24"/>
+                <w:szCs w:val="24"/>
               </w:rPr>
               <w:t xml:space="preserve"> 3)</w:t>
             </w:r>
@@ -4508,6 +4646,7 @@
               <w:rPr>
                 <w:color w:val="000000" w:themeColor="text1"/>
                 <w:sz w:val="24"/>
+                <w:szCs w:val="24"/>
               </w:rPr>
             </w:pPr>
             <w:r>
@@ -4515,6 +4654,7 @@
                 <w:color w:val="000000" w:themeColor="text1"/>
                 <w:spacing w:val="-2"/>
                 <w:sz w:val="24"/>
+                <w:szCs w:val="24"/>
               </w:rPr>
               <w:t>${signature}</w:t>
             </w:r>
@@ -4654,13 +4794,23 @@
         </w:rPr>
         <w:t xml:space="preserve"> </w:t>
       </w:r>
+      <w:proofErr w:type="spellStart"/>
       <w:r>
         <w:rPr>
           <w:rFonts w:ascii="Times New Roman" w:hAnsi="Times New Roman" w:cs="Times New Roman"/>
           <w:color w:val="000000" w:themeColor="text1"/>
           <w:spacing w:val="-2"/>
         </w:rPr>
-        <w:t>Studi,</w:t>
+        <w:t>Studi</w:t>
+      </w:r>
+      <w:proofErr w:type="spellEnd"/>
+      <w:r>
+        <w:rPr>
+          <w:rFonts w:ascii="Times New Roman" w:hAnsi="Times New Roman" w:cs="Times New Roman"/>
+          <w:color w:val="000000" w:themeColor="text1"/>
+          <w:spacing w:val="-2"/>
+        </w:rPr>
+        <w:t>,</w:t>
       </w:r>
       <w:r>
         <w:rPr>
@@ -4686,6 +4836,7 @@
         </w:rPr>
         <w:t xml:space="preserve"> </w:t>
       </w:r>
+      <w:proofErr w:type="spellStart"/>
       <w:r>
         <w:rPr>
           <w:rFonts w:ascii="Times New Roman" w:hAnsi="Times New Roman" w:cs="Times New Roman"/>
@@ -4693,6 +4844,7 @@
         </w:rPr>
         <w:t>Sidang</w:t>
       </w:r>
+      <w:proofErr w:type="spellEnd"/>
       <w:r>
         <w:rPr>
           <w:rFonts w:ascii="Times New Roman" w:hAnsi="Times New Roman" w:cs="Times New Roman"/>
@@ -4904,7 +5056,17 @@
           <w:color w:val="000000" w:themeColor="text1"/>
           <w:lang w:val="fi-FI"/>
         </w:rPr>
-        <w:t>dan</w:t>
+        <w:t>d</w:t>
+      </w:r>
+      <w:bookmarkStart w:id="0" w:name="_GoBack"/>
+      <w:bookmarkEnd w:id="0"/>
+      <w:r>
+        <w:rPr>
+          <w:i/>
+          <w:color w:val="000000" w:themeColor="text1"/>
+          <w:lang w:val="fi-FI"/>
+        </w:rPr>
+        <w:t>an</w:t>
       </w:r>
       <w:r>
         <w:rPr>
@@ -5014,7 +5176,7 @@
 </file>
 
 <file path=word/endnotes.xml><?xml version="1.0" encoding="utf-8"?>
-<w:endnotes xmlns:wpc="http://schemas.microsoft.com/office/word/2010/wordprocessingCanvas" xmlns:cx="http://schemas.microsoft.com/office/drawing/2014/chartex" xmlns:cx1="http://schemas.microsoft.com/office/drawing/2015/9/8/chartex" xmlns:cx2="http://schemas.microsoft.com/office/drawing/2015/10/21/chartex" xmlns:cx3="http://schemas.microsoft.com/office/drawing/2016/5/9/chartex" xmlns:cx4="http://schemas.microsoft.com/office/drawing/2016/5/10/chartex" xmlns:cx5="http://schemas.microsoft.com/office/drawing/2016/5/11/chartex" xmlns:cx6="http://schemas.microsoft.com/office/drawing/2016/5/12/chartex" xmlns:cx7="http://schemas.microsoft.com/office/drawing/2016/5/13/chartex" xmlns:cx8="http://schemas.microsoft.com/office/drawing/2016/5/14/chartex" xmlns:mc="http://schemas.openxmlformats.org/markup-compatibility/2006" xmlns:aink="http://schemas.microsoft.com/office/drawing/2016/ink" xmlns:am3d="http://schemas.microsoft.com/office/drawing/2017/model3d" xmlns:o="urn:schemas-microsoft-com:office:office" xmlns:oel="http://schemas.microsoft.com/office/2019/extlst" xmlns:r="http://schemas.openxmlformats.org/officeDocument/2006/relationships" xmlns:m="http://schemas.openxmlformats.org/officeDocument/2006/math" xmlns:v="urn:schemas-microsoft-com:vml" xmlns:wp14="http://schemas.microsoft.com/office/word/2010/wordprocessingDrawing" xmlns:wp="http://schemas.openxmlformats.org/drawingml/2006/wordprocessingDrawing" xmlns:w10="urn:schemas-microsoft-com:office:word" xmlns:w="http://schemas.openxmlformats.org/wordprocessingml/2006/main" xmlns:w14="http://schemas.microsoft.com/office/word/2010/wordml" xmlns:w15="http://schemas.microsoft.com/office/word/2012/wordml" xmlns:w16cex="http://schemas.microsoft.com/office/word/2018/wordml/cex" xmlns:w16cid="http://schemas.microsoft.com/office/word/2016/wordml/cid" xmlns:w16="http://schemas.microsoft.com/office/word/2018/wordml" xmlns:w16du="http://schemas.microsoft.com/office/word/2023/wordml/word16du" xmlns:w16sdtdh="http://schemas.microsoft.com/office/word/2020/wordml/sdtdatahash" xmlns:w16sdtfl="http://schemas.microsoft.com/office/word/2024/wordml/sdtformatlock" xmlns:w16se="http://schemas.microsoft.com/office/word/2015/wordml/symex" xmlns:wpg="http://schemas.microsoft.com/office/word/2010/wordprocessingGroup" xmlns:wpi="http://schemas.microsoft.com/office/word/2010/wordprocessingInk" xmlns:wne="http://schemas.microsoft.com/office/word/2006/wordml" xmlns:wps="http://schemas.microsoft.com/office/word/2010/wordprocessingShape" mc:Ignorable="w14 w15 w16se w16cid w16 w16cex w16sdtdh w16sdtfl w16du wp14">
+<w:endnotes xmlns:wpc="http://schemas.microsoft.com/office/word/2010/wordprocessingCanvas" xmlns:cx="http://schemas.microsoft.com/office/drawing/2014/chartex" xmlns:mc="http://schemas.openxmlformats.org/markup-compatibility/2006" xmlns:o="urn:schemas-microsoft-com:office:office" xmlns:r="http://schemas.openxmlformats.org/officeDocument/2006/relationships" xmlns:m="http://schemas.openxmlformats.org/officeDocument/2006/math" xmlns:v="urn:schemas-microsoft-com:vml" xmlns:wp14="http://schemas.microsoft.com/office/word/2010/wordprocessingDrawing" xmlns:wp="http://schemas.openxmlformats.org/drawingml/2006/wordprocessingDrawing" xmlns:w10="urn:schemas-microsoft-com:office:word" xmlns:w="http://schemas.openxmlformats.org/wordprocessingml/2006/main" xmlns:w14="http://schemas.microsoft.com/office/word/2010/wordml" xmlns:w15="http://schemas.microsoft.com/office/word/2012/wordml" xmlns:w16se="http://schemas.microsoft.com/office/word/2015/wordml/symex" xmlns:wpg="http://schemas.microsoft.com/office/word/2010/wordprocessingGroup" xmlns:wpi="http://schemas.microsoft.com/office/word/2010/wordprocessingInk" xmlns:wne="http://schemas.microsoft.com/office/word/2006/wordml" xmlns:wps="http://schemas.microsoft.com/office/word/2010/wordprocessingShape" mc:Ignorable="w14 w15 w16se wp14">
   <w:endnote w:type="separator" w:id="-1">
     <w:p>
       <w:r>
@@ -5033,7 +5195,7 @@
 </file>
 
 <file path=word/footnotes.xml><?xml version="1.0" encoding="utf-8"?>
-<w:footnotes xmlns:wpc="http://schemas.microsoft.com/office/word/2010/wordprocessingCanvas" xmlns:cx="http://schemas.microsoft.com/office/drawing/2014/chartex" xmlns:cx1="http://schemas.microsoft.com/office/drawing/2015/9/8/chartex" xmlns:cx2="http://schemas.microsoft.com/office/drawing/2015/10/21/chartex" xmlns:cx3="http://schemas.microsoft.com/office/drawing/2016/5/9/chartex" xmlns:cx4="http://schemas.microsoft.com/office/drawing/2016/5/10/chartex" xmlns:cx5="http://schemas.microsoft.com/office/drawing/2016/5/11/chartex" xmlns:cx6="http://schemas.microsoft.com/office/drawing/2016/5/12/chartex" xmlns:cx7="http://schemas.microsoft.com/office/drawing/2016/5/13/chartex" xmlns:cx8="http://schemas.microsoft.com/office/drawing/2016/5/14/chartex" xmlns:mc="http://schemas.openxmlformats.org/markup-compatibility/2006" xmlns:aink="http://schemas.microsoft.com/office/drawing/2016/ink" xmlns:am3d="http://schemas.microsoft.com/office/drawing/2017/model3d" xmlns:o="urn:schemas-microsoft-com:office:office" xmlns:oel="http://schemas.microsoft.com/office/2019/extlst" xmlns:r="http://schemas.openxmlformats.org/officeDocument/2006/relationships" xmlns:m="http://schemas.openxmlformats.org/officeDocument/2006/math" xmlns:v="urn:schemas-microsoft-com:vml" xmlns:wp14="http://schemas.microsoft.com/office/word/2010/wordprocessingDrawing" xmlns:wp="http://schemas.openxmlformats.org/drawingml/2006/wordprocessingDrawing" xmlns:w10="urn:schemas-microsoft-com:office:word" xmlns:w="http://schemas.openxmlformats.org/wordprocessingml/2006/main" xmlns:w14="http://schemas.microsoft.com/office/word/2010/wordml" xmlns:w15="http://schemas.microsoft.com/office/word/2012/wordml" xmlns:w16cex="http://schemas.microsoft.com/office/word/2018/wordml/cex" xmlns:w16cid="http://schemas.microsoft.com/office/word/2016/wordml/cid" xmlns:w16="http://schemas.microsoft.com/office/word/2018/wordml" xmlns:w16du="http://schemas.microsoft.com/office/word/2023/wordml/word16du" xmlns:w16sdtdh="http://schemas.microsoft.com/office/word/2020/wordml/sdtdatahash" xmlns:w16sdtfl="http://schemas.microsoft.com/office/word/2024/wordml/sdtformatlock" xmlns:w16se="http://schemas.microsoft.com/office/word/2015/wordml/symex" xmlns:wpg="http://schemas.microsoft.com/office/word/2010/wordprocessingGroup" xmlns:wpi="http://schemas.microsoft.com/office/word/2010/wordprocessingInk" xmlns:wne="http://schemas.microsoft.com/office/word/2006/wordml" xmlns:wps="http://schemas.microsoft.com/office/word/2010/wordprocessingShape" mc:Ignorable="w14 w15 w16se w16cid w16 w16cex w16sdtdh w16sdtfl w16du wp14">
+<w:footnotes xmlns:wpc="http://schemas.microsoft.com/office/word/2010/wordprocessingCanvas" xmlns:cx="http://schemas.microsoft.com/office/drawing/2014/chartex" xmlns:mc="http://schemas.openxmlformats.org/markup-compatibility/2006" xmlns:o="urn:schemas-microsoft-com:office:office" xmlns:r="http://schemas.openxmlformats.org/officeDocument/2006/relationships" xmlns:m="http://schemas.openxmlformats.org/officeDocument/2006/math" xmlns:v="urn:schemas-microsoft-com:vml" xmlns:wp14="http://schemas.microsoft.com/office/word/2010/wordprocessingDrawing" xmlns:wp="http://schemas.openxmlformats.org/drawingml/2006/wordprocessingDrawing" xmlns:w10="urn:schemas-microsoft-com:office:word" xmlns:w="http://schemas.openxmlformats.org/wordprocessingml/2006/main" xmlns:w14="http://schemas.microsoft.com/office/word/2010/wordml" xmlns:w15="http://schemas.microsoft.com/office/word/2012/wordml" xmlns:w16se="http://schemas.microsoft.com/office/word/2015/wordml/symex" xmlns:wpg="http://schemas.microsoft.com/office/word/2010/wordprocessingGroup" xmlns:wpi="http://schemas.microsoft.com/office/word/2010/wordprocessingInk" xmlns:wne="http://schemas.microsoft.com/office/word/2006/wordml" xmlns:wps="http://schemas.microsoft.com/office/word/2010/wordprocessingShape" mc:Ignorable="w14 w15 w16se wp14">
   <w:footnote w:type="separator" w:id="-1">
     <w:p>
       <w:r>
@@ -5052,7 +5214,7 @@
 </file>
 
 <file path=word/header1.xml><?xml version="1.0" encoding="utf-8"?>
-<w:hdr xmlns:wpc="http://schemas.microsoft.com/office/word/2010/wordprocessingCanvas" xmlns:cx="http://schemas.microsoft.com/office/drawing/2014/chartex" xmlns:cx1="http://schemas.microsoft.com/office/drawing/2015/9/8/chartex" xmlns:cx2="http://schemas.microsoft.com/office/drawing/2015/10/21/chartex" xmlns:cx3="http://schemas.microsoft.com/office/drawing/2016/5/9/chartex" xmlns:cx4="http://schemas.microsoft.com/office/drawing/2016/5/10/chartex" xmlns:cx5="http://schemas.microsoft.com/office/drawing/2016/5/11/chartex" xmlns:cx6="http://schemas.microsoft.com/office/drawing/2016/5/12/chartex" xmlns:cx7="http://schemas.microsoft.com/office/drawing/2016/5/13/chartex" xmlns:cx8="http://schemas.microsoft.com/office/drawing/2016/5/14/chartex" xmlns:mc="http://schemas.openxmlformats.org/markup-compatibility/2006" xmlns:aink="http://schemas.microsoft.com/office/drawing/2016/ink" xmlns:am3d="http://schemas.microsoft.com/office/drawing/2017/model3d" xmlns:o="urn:schemas-microsoft-com:office:office" xmlns:oel="http://schemas.microsoft.com/office/2019/extlst" xmlns:r="http://schemas.openxmlformats.org/officeDocument/2006/relationships" xmlns:m="http://schemas.openxmlformats.org/officeDocument/2006/math" xmlns:v="urn:schemas-microsoft-com:vml" xmlns:wp14="http://schemas.microsoft.com/office/word/2010/wordprocessingDrawing" xmlns:wp="http://schemas.openxmlformats.org/drawingml/2006/wordprocessingDrawing" xmlns:w10="urn:schemas-microsoft-com:office:word" xmlns:w="http://schemas.openxmlformats.org/wordprocessingml/2006/main" xmlns:w14="http://schemas.microsoft.com/office/word/2010/wordml" xmlns:w15="http://schemas.microsoft.com/office/word/2012/wordml" xmlns:w16cex="http://schemas.microsoft.com/office/word/2018/wordml/cex" xmlns:w16cid="http://schemas.microsoft.com/office/word/2016/wordml/cid" xmlns:w16="http://schemas.microsoft.com/office/word/2018/wordml" xmlns:w16du="http://schemas.microsoft.com/office/word/2023/wordml/word16du" xmlns:w16sdtdh="http://schemas.microsoft.com/office/word/2020/wordml/sdtdatahash" xmlns:w16sdtfl="http://schemas.microsoft.com/office/word/2024/wordml/sdtformatlock" xmlns:w16se="http://schemas.microsoft.com/office/word/2015/wordml/symex" xmlns:wpg="http://schemas.microsoft.com/office/word/2010/wordprocessingGroup" xmlns:wpi="http://schemas.microsoft.com/office/word/2010/wordprocessingInk" xmlns:wne="http://schemas.microsoft.com/office/word/2006/wordml" xmlns:wps="http://schemas.microsoft.com/office/word/2010/wordprocessingShape" mc:Ignorable="w14 w15 w16se w16cid w16 w16cex w16sdtdh w16sdtfl w16du wp14">
+<w:hdr xmlns:wpc="http://schemas.microsoft.com/office/word/2010/wordprocessingCanvas" xmlns:cx="http://schemas.microsoft.com/office/drawing/2014/chartex" xmlns:mc="http://schemas.openxmlformats.org/markup-compatibility/2006" xmlns:o="urn:schemas-microsoft-com:office:office" xmlns:r="http://schemas.openxmlformats.org/officeDocument/2006/relationships" xmlns:m="http://schemas.openxmlformats.org/officeDocument/2006/math" xmlns:v="urn:schemas-microsoft-com:vml" xmlns:wp14="http://schemas.microsoft.com/office/word/2010/wordprocessingDrawing" xmlns:wp="http://schemas.openxmlformats.org/drawingml/2006/wordprocessingDrawing" xmlns:w10="urn:schemas-microsoft-com:office:word" xmlns:w="http://schemas.openxmlformats.org/wordprocessingml/2006/main" xmlns:w14="http://schemas.microsoft.com/office/word/2010/wordml" xmlns:w15="http://schemas.microsoft.com/office/word/2012/wordml" xmlns:w16se="http://schemas.microsoft.com/office/word/2015/wordml/symex" xmlns:wpg="http://schemas.microsoft.com/office/word/2010/wordprocessingGroup" xmlns:wpi="http://schemas.microsoft.com/office/word/2010/wordprocessingInk" xmlns:wne="http://schemas.microsoft.com/office/word/2006/wordml" xmlns:wps="http://schemas.microsoft.com/office/word/2010/wordprocessingShape" mc:Ignorable="w14 w15 w16se wp14">
   <w:tbl>
     <w:tblPr>
       <w:tblW w:w="9720" w:type="dxa"/>
@@ -5399,7 +5561,7 @@
             </wp:anchor>
           </w:drawing>
         </mc:Choice>
-        <mc:Fallback xmlns:w16cei="http://schemas.microsoft.com/office/word/2026/wordml/cei">
+        <mc:Fallback xmlns:w16cei="http://schemas.microsoft.com/office/word/2026/wordml/cei" xmlns:w16sdtfl="http://schemas.microsoft.com/office/word/2024/wordml/sdtformatlock" xmlns:w16sdtdh="http://schemas.microsoft.com/office/word/2020/wordml/sdtdatahash" xmlns:w16du="http://schemas.microsoft.com/office/word/2023/wordml/word16du" xmlns:w16="http://schemas.microsoft.com/office/word/2018/wordml" xmlns:w16cid="http://schemas.microsoft.com/office/word/2016/wordml/cid" xmlns:w16cex="http://schemas.microsoft.com/office/word/2018/wordml/cex" xmlns:oel="http://schemas.microsoft.com/office/2019/extlst" xmlns:am3d="http://schemas.microsoft.com/office/drawing/2017/model3d" xmlns:aink="http://schemas.microsoft.com/office/drawing/2016/ink" xmlns:cx8="http://schemas.microsoft.com/office/drawing/2016/5/14/chartex" xmlns:cx7="http://schemas.microsoft.com/office/drawing/2016/5/13/chartex" xmlns:cx6="http://schemas.microsoft.com/office/drawing/2016/5/12/chartex" xmlns:cx5="http://schemas.microsoft.com/office/drawing/2016/5/11/chartex" xmlns:cx4="http://schemas.microsoft.com/office/drawing/2016/5/10/chartex" xmlns:cx3="http://schemas.microsoft.com/office/drawing/2016/5/9/chartex" xmlns:cx2="http://schemas.microsoft.com/office/drawing/2015/10/21/chartex" xmlns:cx1="http://schemas.microsoft.com/office/drawing/2015/9/8/chartex">
           <w:pict>
             <v:line w14:anchorId="7E8BAAFE" id="Line 1" o:spid="_x0000_s1026" style="position:absolute;flip:y;z-index:251659264;visibility:visible;mso-wrap-style:square;mso-width-percent:0;mso-height-percent:0;mso-wrap-distance-left:9pt;mso-wrap-distance-top:0;mso-wrap-distance-right:9pt;mso-wrap-distance-bottom:0;mso-position-horizontal:absolute;mso-position-horizontal-relative:margin;mso-position-vertical:absolute;mso-position-vertical-relative:text;mso-width-percent:0;mso-height-percent:0;mso-width-relative:page;mso-height-relative:page" from="-14.4pt,2.95pt" to="464.1pt,4.45pt" o:gfxdata="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" strokeweight="3pt">
               <v:stroke linestyle="thinThin"/>
@@ -5414,7 +5576,7 @@
 </file>
 
 <file path=word/numbering.xml><?xml version="1.0" encoding="utf-8"?>
-<w:numbering xmlns:wpc="http://schemas.microsoft.com/office/word/2010/wordprocessingCanvas" xmlns:cx="http://schemas.microsoft.com/office/drawing/2014/chartex" xmlns:cx1="http://schemas.microsoft.com/office/drawing/2015/9/8/chartex" xmlns:cx2="http://schemas.microsoft.com/office/drawing/2015/10/21/chartex" xmlns:cx3="http://schemas.microsoft.com/office/drawing/2016/5/9/chartex" xmlns:cx4="http://schemas.microsoft.com/office/drawing/2016/5/10/chartex" xmlns:cx5="http://schemas.microsoft.com/office/drawing/2016/5/11/chartex" xmlns:cx6="http://schemas.microsoft.com/office/drawing/2016/5/12/chartex" xmlns:cx7="http://schemas.microsoft.com/office/drawing/2016/5/13/chartex" xmlns:cx8="http://schemas.microsoft.com/office/drawing/2016/5/14/chartex" xmlns:mc="http://schemas.openxmlformats.org/markup-compatibility/2006" xmlns:aink="http://schemas.microsoft.com/office/drawing/2016/ink" xmlns:am3d="http://schemas.microsoft.com/office/drawing/2017/model3d" xmlns:o="urn:schemas-microsoft-com:office:office" xmlns:oel="http://schemas.microsoft.com/office/2019/extlst" xmlns:r="http://schemas.openxmlformats.org/officeDocument/2006/relationships" xmlns:m="http://schemas.openxmlformats.org/officeDocument/2006/math" xmlns:v="urn:schemas-microsoft-com:vml" xmlns:wp14="http://schemas.microsoft.com/office/word/2010/wordprocessingDrawing" xmlns:wp="http://schemas.openxmlformats.org/drawingml/2006/wordprocessingDrawing" xmlns:w10="urn:schemas-microsoft-com:office:word" xmlns:w="http://schemas.openxmlformats.org/wordprocessingml/2006/main" xmlns:w14="http://schemas.microsoft.com/office/word/2010/wordml" xmlns:w15="http://schemas.microsoft.com/office/word/2012/wordml" xmlns:w16cex="http://schemas.microsoft.com/office/word/2018/wordml/cex" xmlns:w16cid="http://schemas.microsoft.com/office/word/2016/wordml/cid" xmlns:w16="http://schemas.microsoft.com/office/word/2018/wordml" xmlns:w16du="http://schemas.microsoft.com/office/word/2023/wordml/word16du" xmlns:w16sdtdh="http://schemas.microsoft.com/office/word/2020/wordml/sdtdatahash" xmlns:w16sdtfl="http://schemas.microsoft.com/office/word/2024/wordml/sdtformatlock" xmlns:w16se="http://schemas.microsoft.com/office/word/2015/wordml/symex" xmlns:wpg="http://schemas.microsoft.com/office/word/2010/wordprocessingGroup" xmlns:wpi="http://schemas.microsoft.com/office/word/2010/wordprocessingInk" xmlns:wne="http://schemas.microsoft.com/office/word/2006/wordml" xmlns:wps="http://schemas.microsoft.com/office/word/2010/wordprocessingShape" mc:Ignorable="w14 w15 w16se w16cid w16 w16cex w16sdtdh w16sdtfl w16du wp14">
+<w:numbering xmlns:wpc="http://schemas.microsoft.com/office/word/2010/wordprocessingCanvas" xmlns:cx="http://schemas.microsoft.com/office/drawing/2014/chartex" xmlns:mc="http://schemas.openxmlformats.org/markup-compatibility/2006" xmlns:o="urn:schemas-microsoft-com:office:office" xmlns:r="http://schemas.openxmlformats.org/officeDocument/2006/relationships" xmlns:m="http://schemas.openxmlformats.org/officeDocument/2006/math" xmlns:v="urn:schemas-microsoft-com:vml" xmlns:wp14="http://schemas.microsoft.com/office/word/2010/wordprocessingDrawing" xmlns:wp="http://schemas.openxmlformats.org/drawingml/2006/wordprocessingDrawing" xmlns:w10="urn:schemas-microsoft-com:office:word" xmlns:w="http://schemas.openxmlformats.org/wordprocessingml/2006/main" xmlns:w14="http://schemas.microsoft.com/office/word/2010/wordml" xmlns:w15="http://schemas.microsoft.com/office/word/2012/wordml" xmlns:w16se="http://schemas.microsoft.com/office/word/2015/wordml/symex" xmlns:wpg="http://schemas.microsoft.com/office/word/2010/wordprocessingGroup" xmlns:wpi="http://schemas.microsoft.com/office/word/2010/wordprocessingInk" xmlns:wne="http://schemas.microsoft.com/office/word/2006/wordml" xmlns:wps="http://schemas.microsoft.com/office/word/2010/wordprocessingShape" mc:Ignorable="w14 w15 w16se wp14">
   <w:abstractNum w:abstractNumId="0" w15:restartNumberingAfterBreak="0">
     <w:nsid w:val="16934123"/>
     <w:multiLevelType w:val="hybridMultilevel"/>
@@ -6197,35 +6359,35 @@
       </w:rPr>
     </w:lvl>
   </w:abstractNum>
-  <w:num w:numId="1" w16cid:durableId="1648168544">
+  <w:num w:numId="1">
     <w:abstractNumId w:val="2"/>
   </w:num>
-  <w:num w:numId="2" w16cid:durableId="1553495895">
+  <w:num w:numId="2">
     <w:abstractNumId w:val="6"/>
   </w:num>
-  <w:num w:numId="3" w16cid:durableId="864057014">
+  <w:num w:numId="3">
     <w:abstractNumId w:val="1"/>
   </w:num>
-  <w:num w:numId="4" w16cid:durableId="375088310">
+  <w:num w:numId="4">
     <w:abstractNumId w:val="3"/>
   </w:num>
-  <w:num w:numId="5" w16cid:durableId="1466968792">
+  <w:num w:numId="5">
     <w:abstractNumId w:val="5"/>
   </w:num>
-  <w:num w:numId="6" w16cid:durableId="853224364">
+  <w:num w:numId="6">
     <w:abstractNumId w:val="0"/>
   </w:num>
-  <w:num w:numId="7" w16cid:durableId="1950239425">
+  <w:num w:numId="7">
     <w:abstractNumId w:val="4"/>
   </w:num>
-  <w:num w:numId="8" w16cid:durableId="1187407563">
+  <w:num w:numId="8">
     <w:abstractNumId w:val="7"/>
   </w:num>
 </w:numbering>
 </file>
 
 <file path=word/styles.xml><?xml version="1.0" encoding="utf-8"?>
-<w:styles xmlns:mc="http://schemas.openxmlformats.org/markup-compatibility/2006" xmlns:r="http://schemas.openxmlformats.org/officeDocument/2006/relationships" xmlns:w="http://schemas.openxmlformats.org/wordprocessingml/2006/main" xmlns:w14="http://schemas.microsoft.com/office/word/2010/wordml" xmlns:w15="http://schemas.microsoft.com/office/word/2012/wordml" xmlns:w16cex="http://schemas.microsoft.com/office/word/2018/wordml/cex" xmlns:w16cid="http://schemas.microsoft.com/office/word/2016/wordml/cid" xmlns:w16="http://schemas.microsoft.com/office/word/2018/wordml" xmlns:w16du="http://schemas.microsoft.com/office/word/2023/wordml/word16du" xmlns:w16sdtdh="http://schemas.microsoft.com/office/word/2020/wordml/sdtdatahash" xmlns:w16sdtfl="http://schemas.microsoft.com/office/word/2024/wordml/sdtformatlock" xmlns:w16se="http://schemas.microsoft.com/office/word/2015/wordml/symex" mc:Ignorable="w14 w15 w16se w16cid w16 w16cex w16sdtdh w16sdtfl w16du">
+<w:styles xmlns:mc="http://schemas.openxmlformats.org/markup-compatibility/2006" xmlns:r="http://schemas.openxmlformats.org/officeDocument/2006/relationships" xmlns:w="http://schemas.openxmlformats.org/wordprocessingml/2006/main" xmlns:w14="http://schemas.microsoft.com/office/word/2010/wordml" xmlns:w15="http://schemas.microsoft.com/office/word/2012/wordml" xmlns:w16se="http://schemas.microsoft.com/office/word/2015/wordml/symex" mc:Ignorable="w14 w15 w16se">
   <w:docDefaults>
     <w:rPrDefault>
       <w:rPr>
@@ -6241,7 +6403,7 @@
       </w:pPr>
     </w:pPrDefault>
   </w:docDefaults>
-  <w:latentStyles w:defLockedState="0" w:defUIPriority="99" w:defSemiHidden="0" w:defUnhideWhenUsed="0" w:defQFormat="0" w:count="376">
+  <w:latentStyles w:defLockedState="0" w:defUIPriority="99" w:defSemiHidden="0" w:defUnhideWhenUsed="0" w:defQFormat="0" w:count="371">
     <w:lsdException w:name="Normal" w:uiPriority="0" w:qFormat="1"/>
     <w:lsdException w:name="heading 1" w:uiPriority="9" w:qFormat="1"/>
     <w:lsdException w:name="heading 2" w:semiHidden="1" w:uiPriority="9" w:unhideWhenUsed="1" w:qFormat="1"/>
@@ -6613,11 +6775,6 @@
     <w:lsdException w:name="List Table 5 Dark Accent 6" w:uiPriority="50"/>
     <w:lsdException w:name="List Table 6 Colorful Accent 6" w:uiPriority="51"/>
     <w:lsdException w:name="List Table 7 Colorful Accent 6" w:uiPriority="52"/>
-    <w:lsdException w:name="Mention" w:semiHidden="1" w:unhideWhenUsed="1"/>
-    <w:lsdException w:name="Smart Hyperlink" w:semiHidden="1" w:unhideWhenUsed="1"/>
-    <w:lsdException w:name="Hashtag" w:semiHidden="1" w:unhideWhenUsed="1"/>
-    <w:lsdException w:name="Unresolved Mention" w:semiHidden="1" w:unhideWhenUsed="1"/>
-    <w:lsdException w:name="Smart Link" w:semiHidden="1" w:unhideWhenUsed="1"/>
   </w:latentStyles>
   <w:style w:type="paragraph" w:default="1" w:styleId="Normal">
     <w:name w:val="Normal"/>
@@ -6658,6 +6815,7 @@
   <w:style w:type="character" w:default="1" w:styleId="DefaultParagraphFont">
     <w:name w:val="Default Paragraph Font"/>
     <w:uiPriority w:val="1"/>
+    <w:semiHidden/>
     <w:unhideWhenUsed/>
   </w:style>
   <w:style w:type="table" w:default="1" w:styleId="TableNormal">
@@ -7202,7 +7360,7 @@
 </file>
 
 <file path=customXml/itemProps1.xml><?xml version="1.0" encoding="utf-8"?>
-<ds:datastoreItem xmlns:ds="http://schemas.openxmlformats.org/officeDocument/2006/customXml" ds:itemID="{8C29E9A3-0A70-4038-A1EE-B5CCD0B9EFF6}">
+<ds:datastoreItem xmlns:ds="http://schemas.openxmlformats.org/officeDocument/2006/customXml" ds:itemID="{C6D68D1C-0370-44B0-8359-F4816ABB35FF}">
   <ds:schemaRefs>
     <ds:schemaRef ds:uri="http://schemas.openxmlformats.org/officeDocument/2006/bibliography"/>
   </ds:schemaRefs>

</xml_diff>